<commit_message>
Update project report and How Klander works guide for phases 6-11
Co-Authored-By: Claude Opus 5.5 <noreply@anthropic.com>
Claude-Session: https://claude.ai/code/session_01NhqM7TX3Ch27xAgk3EwsP6
</commit_message>
<xml_diff>
--- a/docs/How_Klander_Works.docx
+++ b/docs/How_Klander_Works.docx
@@ -58,7 +58,7 @@
           <w:sz w:val="24"/>
           <w:szCs w:val="24"/>
         </w:rPr>
-        <w:t xml:space="preserve"> · October 2026</w:t>
+        <w:t xml:space="preserve"> · October 2026 (updated after phase 11)</w:t>
       </w:r>
     </w:p>
     <w:p>
@@ -172,7 +172,7 @@
         <w:spacing w:after="120" w:line="300"/>
       </w:pPr>
       <w:r>
-        <w:t xml:space="preserve">If you only remember three things:</w:t>
+        <w:t xml:space="preserve">Since then it has grown plans with invites, chat, photo memories, lock-screen notifications and private stats (chapters 10–18). If you only remember three things:</w:t>
       </w:r>
     </w:p>
     <w:p>
@@ -3101,7 +3101,2423 @@
         <w:pageBreakBefore/>
       </w:pPr>
       <w:r>
-        <w:t xml:space="preserve">10. Hosting, deploying and secrets</w:t>
+        <w:t xml:space="preserve">10. What changed after phase 5</w:t>
+      </w:r>
+    </w:p>
+    <w:p>
+      <w:pPr>
+        <w:spacing w:after="120" w:line="300"/>
+      </w:pPr>
+      <w:r>
+        <w:t xml:space="preserve">Phases 1–5 made Klander a calendar you share with friends. Phases 6–11 made it the place plans actually happen. The same three rules still hold: </w:t>
+      </w:r>
+      <w:r>
+        <w:rPr>
+          <w:b/>
+          <w:bCs/>
+        </w:rPr>
+        <w:t xml:space="preserve">privacy in the database, secrets on the server, AI drafts and you decide.</w:t>
+      </w:r>
+    </w:p>
+    <w:p>
+      <w:pPr>
+        <w:spacing w:after="60"/>
+        <w:jc w:val="center"/>
+      </w:pPr>
+      <w:r>
+        <w:drawing>
+          <wp:inline distT="0" distB="0" distL="0" distR="0">
+            <wp:extent cx="5715000" cy="3648075"/>
+            <wp:effectExtent t="0" r="0" b="0" l="0"/>
+            <wp:docPr id="1" name="img" descr="How the parts connect now" title="How the parts connect now"/>
+            <wp:cNvGraphicFramePr>
+              <a:graphicFrameLocks xmlns:a="http://schemas.openxmlformats.org/drawingml/2006/main" noChangeAspect="1"/>
+            </wp:cNvGraphicFramePr>
+            <a:graphic xmlns:a="http://schemas.openxmlformats.org/drawingml/2006/main">
+              <a:graphicData uri="http://schemas.openxmlformats.org/drawingml/2006/picture">
+                <pic:pic xmlns:pic="http://schemas.openxmlformats.org/drawingml/2006/picture">
+                  <pic:nvPicPr>
+                    <pic:cNvPr id="0" name="" descr=""/>
+                    <pic:cNvPicPr>
+                      <a:picLocks noChangeAspect="1" noChangeArrowheads="1"/>
+                    </pic:cNvPicPr>
+                  </pic:nvPicPr>
+                  <pic:blipFill>
+                    <a:blip r:embed="rId10" cstate="none"/>
+                    <a:srcRect/>
+                    <a:stretch>
+                      <a:fillRect/>
+                    </a:stretch>
+                  </pic:blipFill>
+                  <pic:spPr bwMode="auto">
+                    <a:xfrm>
+                      <a:off x="0" y="0"/>
+                      <a:ext cx="5715000" cy="3648075"/>
+                    </a:xfrm>
+                    <a:prstGeom prst="rect">
+                      <a:avLst/>
+                    </a:prstGeom>
+                  </pic:spPr>
+                </pic:pic>
+              </a:graphicData>
+            </a:graphic>
+          </wp:inline>
+        </w:drawing>
+      </w:r>
+    </w:p>
+    <w:p>
+      <w:pPr>
+        <w:spacing w:after="200"/>
+        <w:jc w:val="center"/>
+      </w:pPr>
+      <w:r>
+        <w:rPr>
+          <w:i/>
+          <w:iCs/>
+          <w:color w:val="5C6178"/>
+          <w:sz w:val="19"/>
+          <w:szCs w:val="19"/>
+        </w:rPr>
+        <w:t xml:space="preserve">How the parts connect now</w:t>
+      </w:r>
+    </w:p>
+    <w:tbl>
+      <w:tblPr>
+        <w:tblW w:type="dxa" w:w="9026"/>
+        <w:tblBorders>
+          <w:top w:val="single" w:color="auto" w:sz="4"/>
+          <w:left w:val="single" w:color="auto" w:sz="4"/>
+          <w:bottom w:val="single" w:color="auto" w:sz="4"/>
+          <w:right w:val="single" w:color="auto" w:sz="4"/>
+          <w:insideH w:val="single" w:color="auto" w:sz="4"/>
+          <w:insideV w:val="single" w:color="auto" w:sz="4"/>
+        </w:tblBorders>
+      </w:tblPr>
+      <w:tblGrid>
+        <w:gridCol w:w="2519"/>
+        <w:gridCol w:w="6507"/>
+      </w:tblGrid>
+      <w:tr>
+        <w:trPr>
+          <w:cantSplit/>
+          <w:tblHeader/>
+        </w:trPr>
+        <w:tc>
+          <w:tcPr>
+            <w:tcW w:type="dxa" w:w="2519"/>
+            <w:tcBorders>
+              <w:top w:val="single" w:color="D5D8E3" w:sz="4"/>
+              <w:left w:val="single" w:color="D5D8E3" w:sz="4"/>
+              <w:bottom w:val="single" w:color="D5D8E3" w:sz="4"/>
+              <w:right w:val="single" w:color="D5D8E3" w:sz="4"/>
+            </w:tcBorders>
+            <w:shd w:fill="E5E9FF" w:color="auto" w:val="clear"/>
+            <w:tcMar>
+              <w:top w:type="dxa" w:w="60"/>
+              <w:left w:type="dxa" w:w="100"/>
+              <w:bottom w:type="dxa" w:w="60"/>
+              <w:right w:type="dxa" w:w="100"/>
+            </w:tcMar>
+          </w:tcPr>
+          <w:p>
+            <w:pPr>
+              <w:spacing w:after="20" w:line="264"/>
+            </w:pPr>
+            <w:r>
+              <w:rPr>
+                <w:b/>
+                <w:bCs/>
+                <w:color w:val="151827"/>
+                <w:sz w:val="19"/>
+                <w:szCs w:val="19"/>
+              </w:rPr>
+              <w:t xml:space="preserve">Phase</w:t>
+            </w:r>
+          </w:p>
+        </w:tc>
+        <w:tc>
+          <w:tcPr>
+            <w:tcW w:type="dxa" w:w="6507"/>
+            <w:tcBorders>
+              <w:top w:val="single" w:color="D5D8E3" w:sz="4"/>
+              <w:left w:val="single" w:color="D5D8E3" w:sz="4"/>
+              <w:bottom w:val="single" w:color="D5D8E3" w:sz="4"/>
+              <w:right w:val="single" w:color="D5D8E3" w:sz="4"/>
+            </w:tcBorders>
+            <w:shd w:fill="E5E9FF" w:color="auto" w:val="clear"/>
+            <w:tcMar>
+              <w:top w:type="dxa" w:w="60"/>
+              <w:left w:type="dxa" w:w="100"/>
+              <w:bottom w:type="dxa" w:w="60"/>
+              <w:right w:type="dxa" w:w="100"/>
+            </w:tcMar>
+          </w:tcPr>
+          <w:p>
+            <w:pPr>
+              <w:spacing w:after="20" w:line="264"/>
+            </w:pPr>
+            <w:r>
+              <w:rPr>
+                <w:b/>
+                <w:bCs/>
+                <w:color w:val="151827"/>
+                <w:sz w:val="19"/>
+                <w:szCs w:val="19"/>
+              </w:rPr>
+              <w:t xml:space="preserve">In one line</w:t>
+            </w:r>
+          </w:p>
+        </w:tc>
+      </w:tr>
+      <w:tr>
+        <w:trPr>
+          <w:cantSplit/>
+          <w:tblHeader w:val="false"/>
+        </w:trPr>
+        <w:tc>
+          <w:tcPr>
+            <w:tcW w:type="dxa" w:w="2519"/>
+            <w:tcBorders>
+              <w:top w:val="single" w:color="D5D8E3" w:sz="4"/>
+              <w:left w:val="single" w:color="D5D8E3" w:sz="4"/>
+              <w:bottom w:val="single" w:color="D5D8E3" w:sz="4"/>
+              <w:right w:val="single" w:color="D5D8E3" w:sz="4"/>
+            </w:tcBorders>
+            <w:shd w:fill="FFFFFF" w:color="auto" w:val="clear"/>
+            <w:tcMar>
+              <w:top w:type="dxa" w:w="60"/>
+              <w:left w:type="dxa" w:w="100"/>
+              <w:bottom w:type="dxa" w:w="60"/>
+              <w:right w:type="dxa" w:w="100"/>
+            </w:tcMar>
+          </w:tcPr>
+          <w:p>
+            <w:pPr>
+              <w:spacing w:after="20" w:line="264"/>
+            </w:pPr>
+            <w:r>
+              <w:rPr>
+                <w:sz w:val="19"/>
+                <w:szCs w:val="19"/>
+              </w:rPr>
+              <w:t xml:space="preserve">6 Themes &amp; birthdays</w:t>
+            </w:r>
+          </w:p>
+        </w:tc>
+        <w:tc>
+          <w:tcPr>
+            <w:tcW w:type="dxa" w:w="6507"/>
+            <w:tcBorders>
+              <w:top w:val="single" w:color="D5D8E3" w:sz="4"/>
+              <w:left w:val="single" w:color="D5D8E3" w:sz="4"/>
+              <w:bottom w:val="single" w:color="D5D8E3" w:sz="4"/>
+              <w:right w:val="single" w:color="D5D8E3" w:sz="4"/>
+            </w:tcBorders>
+            <w:shd w:fill="FFFFFF" w:color="auto" w:val="clear"/>
+            <w:tcMar>
+              <w:top w:type="dxa" w:w="60"/>
+              <w:left w:type="dxa" w:w="100"/>
+              <w:bottom w:type="dxa" w:w="60"/>
+              <w:right w:type="dxa" w:w="100"/>
+            </w:tcMar>
+          </w:tcPr>
+          <w:p>
+            <w:pPr>
+              <w:spacing w:after="20" w:line="264"/>
+            </w:pPr>
+            <w:r>
+              <w:rPr>
+                <w:sz w:val="19"/>
+                <w:szCs w:val="19"/>
+              </w:rPr>
+              <w:t xml:space="preserve">Make it yours; never miss a birthday</w:t>
+            </w:r>
+          </w:p>
+        </w:tc>
+      </w:tr>
+      <w:tr>
+        <w:trPr>
+          <w:cantSplit/>
+          <w:tblHeader w:val="false"/>
+        </w:trPr>
+        <w:tc>
+          <w:tcPr>
+            <w:tcW w:type="dxa" w:w="2519"/>
+            <w:tcBorders>
+              <w:top w:val="single" w:color="D5D8E3" w:sz="4"/>
+              <w:left w:val="single" w:color="D5D8E3" w:sz="4"/>
+              <w:bottom w:val="single" w:color="D5D8E3" w:sz="4"/>
+              <w:right w:val="single" w:color="D5D8E3" w:sz="4"/>
+            </w:tcBorders>
+            <w:shd w:fill="FAFBFD" w:color="auto" w:val="clear"/>
+            <w:tcMar>
+              <w:top w:type="dxa" w:w="60"/>
+              <w:left w:type="dxa" w:w="100"/>
+              <w:bottom w:type="dxa" w:w="60"/>
+              <w:right w:type="dxa" w:w="100"/>
+            </w:tcMar>
+          </w:tcPr>
+          <w:p>
+            <w:pPr>
+              <w:spacing w:after="20" w:line="264"/>
+            </w:pPr>
+            <w:r>
+              <w:rPr>
+                <w:sz w:val="19"/>
+                <w:szCs w:val="19"/>
+              </w:rPr>
+              <w:t xml:space="preserve">7 Friends &amp; plans</w:t>
+            </w:r>
+          </w:p>
+        </w:tc>
+        <w:tc>
+          <w:tcPr>
+            <w:tcW w:type="dxa" w:w="6507"/>
+            <w:tcBorders>
+              <w:top w:val="single" w:color="D5D8E3" w:sz="4"/>
+              <w:left w:val="single" w:color="D5D8E3" w:sz="4"/>
+              <w:bottom w:val="single" w:color="D5D8E3" w:sz="4"/>
+              <w:right w:val="single" w:color="D5D8E3" w:sz="4"/>
+            </w:tcBorders>
+            <w:shd w:fill="FAFBFD" w:color="auto" w:val="clear"/>
+            <w:tcMar>
+              <w:top w:type="dxa" w:w="60"/>
+              <w:left w:type="dxa" w:w="100"/>
+              <w:bottom w:type="dxa" w:w="60"/>
+              <w:right w:type="dxa" w:w="100"/>
+            </w:tcMar>
+          </w:tcPr>
+          <w:p>
+            <w:pPr>
+              <w:spacing w:after="20" w:line="264"/>
+            </w:pPr>
+            <w:r>
+              <w:rPr>
+                <w:sz w:val="19"/>
+                <w:szCs w:val="19"/>
+              </w:rPr>
+              <w:t xml:space="preserve">Find a time, invite people, vote, close friends, surprises</w:t>
+            </w:r>
+          </w:p>
+        </w:tc>
+      </w:tr>
+      <w:tr>
+        <w:trPr>
+          <w:cantSplit/>
+          <w:tblHeader w:val="false"/>
+        </w:trPr>
+        <w:tc>
+          <w:tcPr>
+            <w:tcW w:type="dxa" w:w="2519"/>
+            <w:tcBorders>
+              <w:top w:val="single" w:color="D5D8E3" w:sz="4"/>
+              <w:left w:val="single" w:color="D5D8E3" w:sz="4"/>
+              <w:bottom w:val="single" w:color="D5D8E3" w:sz="4"/>
+              <w:right w:val="single" w:color="D5D8E3" w:sz="4"/>
+            </w:tcBorders>
+            <w:shd w:fill="FFFFFF" w:color="auto" w:val="clear"/>
+            <w:tcMar>
+              <w:top w:type="dxa" w:w="60"/>
+              <w:left w:type="dxa" w:w="100"/>
+              <w:bottom w:type="dxa" w:w="60"/>
+              <w:right w:type="dxa" w:w="100"/>
+            </w:tcMar>
+          </w:tcPr>
+          <w:p>
+            <w:pPr>
+              <w:spacing w:after="20" w:line="264"/>
+            </w:pPr>
+            <w:r>
+              <w:rPr>
+                <w:sz w:val="19"/>
+                <w:szCs w:val="19"/>
+              </w:rPr>
+              <w:t xml:space="preserve">8 Chat</w:t>
+            </w:r>
+          </w:p>
+        </w:tc>
+        <w:tc>
+          <w:tcPr>
+            <w:tcW w:type="dxa" w:w="6507"/>
+            <w:tcBorders>
+              <w:top w:val="single" w:color="D5D8E3" w:sz="4"/>
+              <w:left w:val="single" w:color="D5D8E3" w:sz="4"/>
+              <w:bottom w:val="single" w:color="D5D8E3" w:sz="4"/>
+              <w:right w:val="single" w:color="D5D8E3" w:sz="4"/>
+            </w:tcBorders>
+            <w:shd w:fill="FFFFFF" w:color="auto" w:val="clear"/>
+            <w:tcMar>
+              <w:top w:type="dxa" w:w="60"/>
+              <w:left w:type="dxa" w:w="100"/>
+              <w:bottom w:type="dxa" w:w="60"/>
+              <w:right w:type="dxa" w:w="100"/>
+            </w:tcMar>
+          </w:tcPr>
+          <w:p>
+            <w:pPr>
+              <w:spacing w:after="20" w:line="264"/>
+            </w:pPr>
+            <w:r>
+              <w:rPr>
+                <w:sz w:val="19"/>
+                <w:szCs w:val="19"/>
+              </w:rPr>
+              <w:t xml:space="preserve">Messages inside the app, with a chat for every plan</w:t>
+            </w:r>
+          </w:p>
+        </w:tc>
+      </w:tr>
+      <w:tr>
+        <w:trPr>
+          <w:cantSplit/>
+          <w:tblHeader w:val="false"/>
+        </w:trPr>
+        <w:tc>
+          <w:tcPr>
+            <w:tcW w:type="dxa" w:w="2519"/>
+            <w:tcBorders>
+              <w:top w:val="single" w:color="D5D8E3" w:sz="4"/>
+              <w:left w:val="single" w:color="D5D8E3" w:sz="4"/>
+              <w:bottom w:val="single" w:color="D5D8E3" w:sz="4"/>
+              <w:right w:val="single" w:color="D5D8E3" w:sz="4"/>
+            </w:tcBorders>
+            <w:shd w:fill="FAFBFD" w:color="auto" w:val="clear"/>
+            <w:tcMar>
+              <w:top w:type="dxa" w:w="60"/>
+              <w:left w:type="dxa" w:w="100"/>
+              <w:bottom w:type="dxa" w:w="60"/>
+              <w:right w:type="dxa" w:w="100"/>
+            </w:tcMar>
+          </w:tcPr>
+          <w:p>
+            <w:pPr>
+              <w:spacing w:after="20" w:line="264"/>
+            </w:pPr>
+            <w:r>
+              <w:rPr>
+                <w:sz w:val="19"/>
+                <w:szCs w:val="19"/>
+              </w:rPr>
+              <w:t xml:space="preserve">9 Memories</w:t>
+            </w:r>
+          </w:p>
+        </w:tc>
+        <w:tc>
+          <w:tcPr>
+            <w:tcW w:type="dxa" w:w="6507"/>
+            <w:tcBorders>
+              <w:top w:val="single" w:color="D5D8E3" w:sz="4"/>
+              <w:left w:val="single" w:color="D5D8E3" w:sz="4"/>
+              <w:bottom w:val="single" w:color="D5D8E3" w:sz="4"/>
+              <w:right w:val="single" w:color="D5D8E3" w:sz="4"/>
+            </w:tcBorders>
+            <w:shd w:fill="FAFBFD" w:color="auto" w:val="clear"/>
+            <w:tcMar>
+              <w:top w:type="dxa" w:w="60"/>
+              <w:left w:type="dxa" w:w="100"/>
+              <w:bottom w:type="dxa" w:w="60"/>
+              <w:right w:type="dxa" w:w="100"/>
+            </w:tcMar>
+          </w:tcPr>
+          <w:p>
+            <w:pPr>
+              <w:spacing w:after="20" w:line="264"/>
+            </w:pPr>
+            <w:r>
+              <w:rPr>
+                <w:sz w:val="19"/>
+                <w:szCs w:val="19"/>
+              </w:rPr>
+              <w:t xml:space="preserve">Photos on events and a weekly "My Week" story</w:t>
+            </w:r>
+          </w:p>
+        </w:tc>
+      </w:tr>
+      <w:tr>
+        <w:trPr>
+          <w:cantSplit/>
+          <w:tblHeader w:val="false"/>
+        </w:trPr>
+        <w:tc>
+          <w:tcPr>
+            <w:tcW w:type="dxa" w:w="2519"/>
+            <w:tcBorders>
+              <w:top w:val="single" w:color="D5D8E3" w:sz="4"/>
+              <w:left w:val="single" w:color="D5D8E3" w:sz="4"/>
+              <w:bottom w:val="single" w:color="D5D8E3" w:sz="4"/>
+              <w:right w:val="single" w:color="D5D8E3" w:sz="4"/>
+            </w:tcBorders>
+            <w:shd w:fill="FFFFFF" w:color="auto" w:val="clear"/>
+            <w:tcMar>
+              <w:top w:type="dxa" w:w="60"/>
+              <w:left w:type="dxa" w:w="100"/>
+              <w:bottom w:type="dxa" w:w="60"/>
+              <w:right w:type="dxa" w:w="100"/>
+            </w:tcMar>
+          </w:tcPr>
+          <w:p>
+            <w:pPr>
+              <w:spacing w:after="20" w:line="264"/>
+            </w:pPr>
+            <w:r>
+              <w:rPr>
+                <w:sz w:val="19"/>
+                <w:szCs w:val="19"/>
+              </w:rPr>
+              <w:t xml:space="preserve">10 Notifications &amp; sync</w:t>
+            </w:r>
+          </w:p>
+        </w:tc>
+        <w:tc>
+          <w:tcPr>
+            <w:tcW w:type="dxa" w:w="6507"/>
+            <w:tcBorders>
+              <w:top w:val="single" w:color="D5D8E3" w:sz="4"/>
+              <w:left w:val="single" w:color="D5D8E3" w:sz="4"/>
+              <w:bottom w:val="single" w:color="D5D8E3" w:sz="4"/>
+              <w:right w:val="single" w:color="D5D8E3" w:sz="4"/>
+            </w:tcBorders>
+            <w:shd w:fill="FFFFFF" w:color="auto" w:val="clear"/>
+            <w:tcMar>
+              <w:top w:type="dxa" w:w="60"/>
+              <w:left w:type="dxa" w:w="100"/>
+              <w:bottom w:type="dxa" w:w="60"/>
+              <w:right w:type="dxa" w:w="100"/>
+            </w:tcMar>
+          </w:tcPr>
+          <w:p>
+            <w:pPr>
+              <w:spacing w:after="20" w:line="264"/>
+            </w:pPr>
+            <w:r>
+              <w:rPr>
+                <w:sz w:val="19"/>
+                <w:szCs w:val="19"/>
+              </w:rPr>
+              <w:t xml:space="preserve">Lock-screen alerts, reminders, sleep after shifts, family link</w:t>
+            </w:r>
+          </w:p>
+        </w:tc>
+      </w:tr>
+      <w:tr>
+        <w:trPr>
+          <w:cantSplit/>
+          <w:tblHeader w:val="false"/>
+        </w:trPr>
+        <w:tc>
+          <w:tcPr>
+            <w:tcW w:type="dxa" w:w="2519"/>
+            <w:tcBorders>
+              <w:top w:val="single" w:color="D5D8E3" w:sz="4"/>
+              <w:left w:val="single" w:color="D5D8E3" w:sz="4"/>
+              <w:bottom w:val="single" w:color="D5D8E3" w:sz="4"/>
+              <w:right w:val="single" w:color="D5D8E3" w:sz="4"/>
+            </w:tcBorders>
+            <w:shd w:fill="FAFBFD" w:color="auto" w:val="clear"/>
+            <w:tcMar>
+              <w:top w:type="dxa" w:w="60"/>
+              <w:left w:type="dxa" w:w="100"/>
+              <w:bottom w:type="dxa" w:w="60"/>
+              <w:right w:type="dxa" w:w="100"/>
+            </w:tcMar>
+          </w:tcPr>
+          <w:p>
+            <w:pPr>
+              <w:spacing w:after="20" w:line="264"/>
+            </w:pPr>
+            <w:r>
+              <w:rPr>
+                <w:sz w:val="19"/>
+                <w:szCs w:val="19"/>
+              </w:rPr>
+              <w:t xml:space="preserve">11 Insights</w:t>
+            </w:r>
+          </w:p>
+        </w:tc>
+        <w:tc>
+          <w:tcPr>
+            <w:tcW w:type="dxa" w:w="6507"/>
+            <w:tcBorders>
+              <w:top w:val="single" w:color="D5D8E3" w:sz="4"/>
+              <w:left w:val="single" w:color="D5D8E3" w:sz="4"/>
+              <w:bottom w:val="single" w:color="D5D8E3" w:sz="4"/>
+              <w:right w:val="single" w:color="D5D8E3" w:sz="4"/>
+            </w:tcBorders>
+            <w:shd w:fill="FAFBFD" w:color="auto" w:val="clear"/>
+            <w:tcMar>
+              <w:top w:type="dxa" w:w="60"/>
+              <w:left w:type="dxa" w:w="100"/>
+              <w:bottom w:type="dxa" w:w="60"/>
+              <w:right w:type="dxa" w:w="100"/>
+            </w:tcMar>
+          </w:tcPr>
+          <w:p>
+            <w:pPr>
+              <w:spacing w:after="20" w:line="264"/>
+            </w:pPr>
+            <w:r>
+              <w:rPr>
+                <w:sz w:val="19"/>
+                <w:szCs w:val="19"/>
+              </w:rPr>
+              <w:t xml:space="preserve">Private stats, streaks and an end-of-term Wrapped</w:t>
+            </w:r>
+          </w:p>
+        </w:tc>
+      </w:tr>
+      <w:tr>
+        <w:trPr>
+          <w:cantSplit/>
+          <w:tblHeader w:val="false"/>
+        </w:trPr>
+        <w:tc>
+          <w:tcPr>
+            <w:tcW w:type="dxa" w:w="2519"/>
+            <w:tcBorders>
+              <w:top w:val="single" w:color="D5D8E3" w:sz="4"/>
+              <w:left w:val="single" w:color="D5D8E3" w:sz="4"/>
+              <w:bottom w:val="single" w:color="D5D8E3" w:sz="4"/>
+              <w:right w:val="single" w:color="D5D8E3" w:sz="4"/>
+            </w:tcBorders>
+            <w:shd w:fill="FFFFFF" w:color="auto" w:val="clear"/>
+            <w:tcMar>
+              <w:top w:type="dxa" w:w="60"/>
+              <w:left w:type="dxa" w:w="100"/>
+              <w:bottom w:type="dxa" w:w="60"/>
+              <w:right w:type="dxa" w:w="100"/>
+            </w:tcMar>
+          </w:tcPr>
+          <w:p>
+            <w:pPr>
+              <w:spacing w:after="20" w:line="264"/>
+            </w:pPr>
+            <w:r>
+              <w:rPr>
+                <w:sz w:val="19"/>
+                <w:szCs w:val="19"/>
+              </w:rPr>
+              <w:t xml:space="preserve">Extras</w:t>
+            </w:r>
+          </w:p>
+        </w:tc>
+        <w:tc>
+          <w:tcPr>
+            <w:tcW w:type="dxa" w:w="6507"/>
+            <w:tcBorders>
+              <w:top w:val="single" w:color="D5D8E3" w:sz="4"/>
+              <w:left w:val="single" w:color="D5D8E3" w:sz="4"/>
+              <w:bottom w:val="single" w:color="D5D8E3" w:sz="4"/>
+              <w:right w:val="single" w:color="D5D8E3" w:sz="4"/>
+            </w:tcBorders>
+            <w:shd w:fill="FFFFFF" w:color="auto" w:val="clear"/>
+            <w:tcMar>
+              <w:top w:type="dxa" w:w="60"/>
+              <w:left w:type="dxa" w:w="100"/>
+              <w:bottom w:type="dxa" w:w="60"/>
+              <w:right w:type="dxa" w:w="100"/>
+            </w:tcMar>
+          </w:tcPr>
+          <w:p>
+            <w:pPr>
+              <w:spacing w:after="20" w:line="264"/>
+            </w:pPr>
+            <w:r>
+              <w:rPr>
+                <w:sz w:val="19"/>
+                <w:szCs w:val="19"/>
+              </w:rPr>
+              <w:t xml:space="preserve">Swipeable redesign, welcome tour, Help &amp; tips, Add to Home Screen guide</w:t>
+            </w:r>
+          </w:p>
+        </w:tc>
+      </w:tr>
+    </w:tbl>
+    <w:p>
+      <w:pPr>
+        <w:pStyle w:val="Heading1"/>
+        <w:pageBreakBefore/>
+      </w:pPr>
+      <w:r>
+        <w:t xml:space="preserve">11. Themes and birthdays</w:t>
+      </w:r>
+    </w:p>
+    <w:p>
+      <w:pPr>
+        <w:pStyle w:val="Heading2"/>
+      </w:pPr>
+      <w:r>
+        <w:t xml:space="preserve">Themes</w:t>
+      </w:r>
+    </w:p>
+    <w:p>
+      <w:pPr>
+        <w:pStyle w:val="ListParagraph"/>
+        <w:numPr>
+          <w:ilvl w:val="0"/>
+          <w:numId w:val="4"/>
+        </w:numPr>
+        <w:spacing w:after="60" w:line="288"/>
+      </w:pPr>
+      <w:r>
+        <w:t xml:space="preserve">A theme is just a set of </w:t>
+      </w:r>
+      <w:r>
+        <w:rPr>
+          <w:b/>
+          <w:bCs/>
+        </w:rPr>
+        <w:t xml:space="preserve">colour tokens</w:t>
+      </w:r>
+      <w:r>
+        <w:t xml:space="preserve"> (</w:t>
+      </w:r>
+      <w:r>
+        <w:rPr>
+          <w:rFonts w:ascii="Consolas" w:cs="Consolas" w:eastAsia="Consolas" w:hAnsi="Consolas"/>
+          <w:color w:val="1F3A93"/>
+          <w:sz w:val="19"/>
+          <w:szCs w:val="19"/>
+        </w:rPr>
+        <w:t xml:space="preserve">--bg</w:t>
+      </w:r>
+      <w:r>
+        <w:t xml:space="preserve">, </w:t>
+      </w:r>
+      <w:r>
+        <w:rPr>
+          <w:rFonts w:ascii="Consolas" w:cs="Consolas" w:eastAsia="Consolas" w:hAnsi="Consolas"/>
+          <w:color w:val="1F3A93"/>
+          <w:sz w:val="19"/>
+          <w:szCs w:val="19"/>
+        </w:rPr>
+        <w:t xml:space="preserve">--ink</w:t>
+      </w:r>
+      <w:r>
+        <w:t xml:space="preserve">, </w:t>
+      </w:r>
+      <w:r>
+        <w:rPr>
+          <w:rFonts w:ascii="Consolas" w:cs="Consolas" w:eastAsia="Consolas" w:hAnsi="Consolas"/>
+          <w:color w:val="1F3A93"/>
+          <w:sz w:val="19"/>
+          <w:szCs w:val="19"/>
+        </w:rPr>
+        <w:t xml:space="preserve">--accent</w:t>
+      </w:r>
+      <w:r>
+        <w:t xml:space="preserve">…). Changing theme swaps the tokens and everything restyles.</w:t>
+      </w:r>
+    </w:p>
+    <w:p>
+      <w:pPr>
+        <w:pStyle w:val="ListParagraph"/>
+        <w:numPr>
+          <w:ilvl w:val="0"/>
+          <w:numId w:val="4"/>
+        </w:numPr>
+        <w:spacing w:after="60" w:line="288"/>
+      </w:pPr>
+      <w:r>
+        <w:rPr>
+          <w:b/>
+          <w:bCs/>
+        </w:rPr>
+        <w:t xml:space="preserve">Contrast guard:</w:t>
+      </w:r>
+      <w:r>
+        <w:t xml:space="preserve"> whatever colours someone picks, the app checks the contrast ratio between text and background (the same maths as the accessibility guidelines) and nudges the text colour until it's readable. 200 automated checks cover every theme in light and dark at four times of day.</w:t>
+      </w:r>
+    </w:p>
+    <w:p>
+      <w:pPr>
+        <w:pStyle w:val="ListParagraph"/>
+        <w:numPr>
+          <w:ilvl w:val="0"/>
+          <w:numId w:val="4"/>
+        </w:numPr>
+        <w:spacing w:after="60" w:line="288"/>
+      </w:pPr>
+      <w:r>
+        <w:rPr>
+          <w:b/>
+          <w:bCs/>
+        </w:rPr>
+        <w:t xml:space="preserve">Theme from a photo:</w:t>
+      </w:r>
+      <w:r>
+        <w:t xml:space="preserve"> the phone shrinks the photo and groups its pixels into 5 main colours using </w:t>
+      </w:r>
+      <w:r>
+        <w:rPr>
+          <w:b/>
+          <w:bCs/>
+        </w:rPr>
+        <w:t xml:space="preserve">k-means</w:t>
+      </w:r>
+      <w:r>
+        <w:t xml:space="preserve"> clustering. It never uploads the photo.</w:t>
+      </w:r>
+    </w:p>
+    <w:p>
+      <w:pPr>
+        <w:pStyle w:val="ListParagraph"/>
+        <w:numPr>
+          <w:ilvl w:val="0"/>
+          <w:numId w:val="4"/>
+        </w:numPr>
+        <w:spacing w:after="60" w:line="288"/>
+      </w:pPr>
+      <w:r>
+        <w:rPr>
+          <w:b/>
+          <w:bCs/>
+        </w:rPr>
+        <w:t xml:space="preserve">Theme codes</w:t>
+      </w:r>
+      <w:r>
+        <w:t xml:space="preserve"> like </w:t>
+      </w:r>
+      <w:r>
+        <w:rPr>
+          <w:rFonts w:ascii="Consolas" w:cs="Consolas" w:eastAsia="Consolas" w:hAnsi="Consolas"/>
+          <w:color w:val="1F3A93"/>
+          <w:sz w:val="19"/>
+          <w:szCs w:val="19"/>
+        </w:rPr>
+        <w:t xml:space="preserve">KL1-…</w:t>
+      </w:r>
+      <w:r>
+        <w:t xml:space="preserve"> are the theme settings encoded as text. When someone pastes one, it's cleaned first: only known settings and real hex colours are kept, so a code can't smuggle anything in.</w:t>
+      </w:r>
+    </w:p>
+    <w:p>
+      <w:pPr>
+        <w:pStyle w:val="Heading2"/>
+      </w:pPr>
+      <w:r>
+        <w:t xml:space="preserve">Birthdays</w:t>
+      </w:r>
+    </w:p>
+    <w:p>
+      <w:pPr>
+        <w:pStyle w:val="ListParagraph"/>
+        <w:numPr>
+          <w:ilvl w:val="0"/>
+          <w:numId w:val="4"/>
+        </w:numPr>
+        <w:spacing w:after="60" w:line="288"/>
+      </w:pPr>
+      <w:r>
+        <w:t xml:space="preserve">You add your birthday once. Friends get it from </w:t>
+      </w:r>
+      <w:r>
+        <w:rPr>
+          <w:rFonts w:ascii="Consolas" w:cs="Consolas" w:eastAsia="Consolas" w:hAnsi="Consolas"/>
+          <w:color w:val="1F3A93"/>
+          <w:sz w:val="19"/>
+          <w:szCs w:val="19"/>
+        </w:rPr>
+        <w:t xml:space="preserve">friend_birthdays()</w:t>
+      </w:r>
+      <w:r>
+        <w:t xml:space="preserve">, which returns the year only if you allowed it.</w:t>
+      </w:r>
+    </w:p>
+    <w:p>
+      <w:pPr>
+        <w:pStyle w:val="ListParagraph"/>
+        <w:numPr>
+          <w:ilvl w:val="0"/>
+          <w:numId w:val="4"/>
+        </w:numPr>
+        <w:spacing w:after="60" w:line="288"/>
+      </w:pPr>
+      <w:r>
+        <w:t xml:space="preserve">Birthdays are worked out every year on the phone, not saved as events. A 29 February birthday shows on 28 February in other years.</w:t>
+      </w:r>
+    </w:p>
+    <w:p>
+      <w:pPr>
+        <w:pStyle w:val="Heading1"/>
+        <w:pageBreakBefore/>
+      </w:pPr>
+      <w:r>
+        <w:t xml:space="preserve">12. Plans and finding a time</w:t>
+      </w:r>
+    </w:p>
+    <w:p>
+      <w:pPr>
+        <w:pStyle w:val="Heading2"/>
+      </w:pPr>
+      <w:r>
+        <w:t xml:space="preserve">The free-time finder</w:t>
+      </w:r>
+    </w:p>
+    <w:p>
+      <w:pPr>
+        <w:pStyle w:val="ListParagraph"/>
+        <w:numPr>
+          <w:ilvl w:val="0"/>
+          <w:numId w:val="8"/>
+        </w:numPr>
+        <w:spacing w:after="60" w:line="288"/>
+      </w:pPr>
+      <w:r>
+        <w:t xml:space="preserve">The app asks the database for friends' </w:t>
+      </w:r>
+      <w:r>
+        <w:rPr>
+          <w:b/>
+          <w:bCs/>
+        </w:rPr>
+        <w:t xml:space="preserve">busy times only</w:t>
+      </w:r>
+      <w:r>
+        <w:t xml:space="preserve"> (</w:t>
+      </w:r>
+      <w:r>
+        <w:rPr>
+          <w:rFonts w:ascii="Consolas" w:cs="Consolas" w:eastAsia="Consolas" w:hAnsi="Consolas"/>
+          <w:color w:val="1F3A93"/>
+          <w:sz w:val="19"/>
+          <w:szCs w:val="19"/>
+        </w:rPr>
+        <w:t xml:space="preserve">friend_busy_v2()</w:t>
+      </w:r>
+      <w:r>
+        <w:t xml:space="preserve">): start, end and whether it repeats. No titles, places or notes.</w:t>
+      </w:r>
+    </w:p>
+    <w:p>
+      <w:pPr>
+        <w:pStyle w:val="ListParagraph"/>
+        <w:numPr>
+          <w:ilvl w:val="0"/>
+          <w:numId w:val="8"/>
+        </w:numPr>
+        <w:spacing w:after="60" w:line="288"/>
+      </w:pPr>
+      <w:r>
+        <w:t xml:space="preserve">It expands repeats (including night shifts across the clock change), then merges overlapping blocks for each person.</w:t>
+      </w:r>
+    </w:p>
+    <w:p>
+      <w:pPr>
+        <w:pStyle w:val="ListParagraph"/>
+        <w:numPr>
+          <w:ilvl w:val="0"/>
+          <w:numId w:val="8"/>
+        </w:numPr>
+        <w:spacing w:after="60" w:line="288"/>
+      </w:pPr>
+      <w:r>
+        <w:t xml:space="preserve">For each day it looks for gaps everyone shares that are long enough, between the hours you chose.</w:t>
+      </w:r>
+    </w:p>
+    <w:p>
+      <w:pPr>
+        <w:pStyle w:val="ListParagraph"/>
+        <w:numPr>
+          <w:ilvl w:val="0"/>
+          <w:numId w:val="8"/>
+        </w:numPr>
+        <w:spacing w:after="60" w:line="288"/>
+      </w:pPr>
+      <w:r>
+        <w:t xml:space="preserve">It also finds "everyone except one person" gaps, which is often the best you can get.</w:t>
+      </w:r>
+    </w:p>
+    <w:p>
+      <w:pPr>
+        <w:pBdr>
+          <w:left w:val="single" w:color="2B4CFF" w:sz="18" w:space="8"/>
+        </w:pBdr>
+        <w:shd w:fill="EEF1FF" w:color="auto" w:val="clear"/>
+        <w:spacing w:after="160" w:before="80" w:line="288"/>
+        <w:ind w:left="160" w:right="160"/>
+      </w:pPr>
+      <w:r>
+        <w:rPr>
+          <w:b/>
+          <w:bCs/>
+          <w:sz w:val="20"/>
+          <w:szCs w:val="20"/>
+        </w:rPr>
+        <w:t xml:space="preserve">Interview point:</w:t>
+      </w:r>
+      <w:r>
+        <w:rPr>
+          <w:sz w:val="20"/>
+          <w:szCs w:val="20"/>
+        </w:rPr>
+        <w:t xml:space="preserve"> "Find a time" is useful precisely because it doesn't need to know what anyone is doing, only when. That's privacy by design: the data that isn't needed never leaves the database.</w:t>
+      </w:r>
+    </w:p>
+    <w:p>
+      <w:pPr>
+        <w:pStyle w:val="Heading2"/>
+      </w:pPr>
+      <w:r>
+        <w:t xml:space="preserve">Invites, polls and "Up for something"</w:t>
+      </w:r>
+    </w:p>
+    <w:p>
+      <w:pPr>
+        <w:pStyle w:val="ListParagraph"/>
+        <w:numPr>
+          <w:ilvl w:val="0"/>
+          <w:numId w:val="4"/>
+        </w:numPr>
+        <w:spacing w:after="60" w:line="288"/>
+      </w:pPr>
+      <w:r>
+        <w:rPr>
+          <w:b/>
+          <w:bCs/>
+        </w:rPr>
+        <w:t xml:space="preserve">Invites</w:t>
+      </w:r>
+      <w:r>
+        <w:t xml:space="preserve"> are rows in </w:t>
+      </w:r>
+      <w:r>
+        <w:rPr>
+          <w:rFonts w:ascii="Consolas" w:cs="Consolas" w:eastAsia="Consolas" w:hAnsi="Consolas"/>
+          <w:color w:val="1F3A93"/>
+          <w:sz w:val="19"/>
+          <w:szCs w:val="19"/>
+        </w:rPr>
+        <w:t xml:space="preserve">event_invites</w:t>
+      </w:r>
+      <w:r>
+        <w:t xml:space="preserve">. The database only lets you invite friends to your own events, and a guest can only change their own answer.</w:t>
+      </w:r>
+    </w:p>
+    <w:p>
+      <w:pPr>
+        <w:pStyle w:val="ListParagraph"/>
+        <w:numPr>
+          <w:ilvl w:val="0"/>
+          <w:numId w:val="4"/>
+        </w:numPr>
+        <w:spacing w:after="60" w:line="288"/>
+      </w:pPr>
+      <w:r>
+        <w:rPr>
+          <w:b/>
+          <w:bCs/>
+        </w:rPr>
+        <w:t xml:space="preserve">Polls</w:t>
+      </w:r>
+      <w:r>
+        <w:t xml:space="preserve">: you pick 2–5 times; invitees vote yes / maybe / no; you pick the winner and it becomes an event.</w:t>
+      </w:r>
+    </w:p>
+    <w:p>
+      <w:pPr>
+        <w:pStyle w:val="ListParagraph"/>
+        <w:numPr>
+          <w:ilvl w:val="0"/>
+          <w:numId w:val="4"/>
+        </w:numPr>
+        <w:spacing w:after="60" w:line="288"/>
+      </w:pPr>
+      <w:r>
+        <w:rPr>
+          <w:b/>
+          <w:bCs/>
+        </w:rPr>
+        <w:t xml:space="preserve">"Up for something?"</w:t>
+      </w:r>
+      <w:r>
+        <w:t xml:space="preserve"> is a short post that expires. Friends reply "I'm in".</w:t>
+      </w:r>
+    </w:p>
+    <w:p>
+      <w:pPr>
+        <w:pStyle w:val="Heading2"/>
+      </w:pPr>
+      <w:r>
+        <w:t xml:space="preserve">Close friends and surprises</w:t>
+      </w:r>
+    </w:p>
+    <w:tbl>
+      <w:tblPr>
+        <w:tblW w:type="dxa" w:w="9026"/>
+        <w:tblBorders>
+          <w:top w:val="single" w:color="auto" w:sz="4"/>
+          <w:left w:val="single" w:color="auto" w:sz="4"/>
+          <w:bottom w:val="single" w:color="auto" w:sz="4"/>
+          <w:right w:val="single" w:color="auto" w:sz="4"/>
+          <w:insideH w:val="single" w:color="auto" w:sz="4"/>
+          <w:insideV w:val="single" w:color="auto" w:sz="4"/>
+        </w:tblBorders>
+      </w:tblPr>
+      <w:tblGrid>
+        <w:gridCol w:w="2099"/>
+        <w:gridCol w:w="3463"/>
+        <w:gridCol w:w="3464"/>
+      </w:tblGrid>
+      <w:tr>
+        <w:trPr>
+          <w:cantSplit/>
+          <w:tblHeader/>
+        </w:trPr>
+        <w:tc>
+          <w:tcPr>
+            <w:tcW w:type="dxa" w:w="2099"/>
+            <w:tcBorders>
+              <w:top w:val="single" w:color="D5D8E3" w:sz="4"/>
+              <w:left w:val="single" w:color="D5D8E3" w:sz="4"/>
+              <w:bottom w:val="single" w:color="D5D8E3" w:sz="4"/>
+              <w:right w:val="single" w:color="D5D8E3" w:sz="4"/>
+            </w:tcBorders>
+            <w:shd w:fill="E5E9FF" w:color="auto" w:val="clear"/>
+            <w:tcMar>
+              <w:top w:type="dxa" w:w="60"/>
+              <w:left w:type="dxa" w:w="100"/>
+              <w:bottom w:type="dxa" w:w="60"/>
+              <w:right w:type="dxa" w:w="100"/>
+            </w:tcMar>
+          </w:tcPr>
+          <w:p>
+            <w:pPr>
+              <w:spacing w:after="20" w:line="264"/>
+            </w:pPr>
+            <w:r>
+              <w:rPr>
+                <w:b/>
+                <w:bCs/>
+                <w:color w:val="151827"/>
+                <w:sz w:val="19"/>
+                <w:szCs w:val="19"/>
+              </w:rPr>
+              <w:t xml:space="preserve">Visibility</w:t>
+            </w:r>
+          </w:p>
+        </w:tc>
+        <w:tc>
+          <w:tcPr>
+            <w:tcW w:type="dxa" w:w="3463"/>
+            <w:tcBorders>
+              <w:top w:val="single" w:color="D5D8E3" w:sz="4"/>
+              <w:left w:val="single" w:color="D5D8E3" w:sz="4"/>
+              <w:bottom w:val="single" w:color="D5D8E3" w:sz="4"/>
+              <w:right w:val="single" w:color="D5D8E3" w:sz="4"/>
+            </w:tcBorders>
+            <w:shd w:fill="E5E9FF" w:color="auto" w:val="clear"/>
+            <w:tcMar>
+              <w:top w:type="dxa" w:w="60"/>
+              <w:left w:type="dxa" w:w="100"/>
+              <w:bottom w:type="dxa" w:w="60"/>
+              <w:right w:type="dxa" w:w="100"/>
+            </w:tcMar>
+          </w:tcPr>
+          <w:p>
+            <w:pPr>
+              <w:spacing w:after="20" w:line="264"/>
+            </w:pPr>
+            <w:r>
+              <w:rPr>
+                <w:b/>
+                <w:bCs/>
+                <w:color w:val="151827"/>
+                <w:sz w:val="19"/>
+                <w:szCs w:val="19"/>
+              </w:rPr>
+              <w:t xml:space="preserve">Close friends see</w:t>
+            </w:r>
+          </w:p>
+        </w:tc>
+        <w:tc>
+          <w:tcPr>
+            <w:tcW w:type="dxa" w:w="3464"/>
+            <w:tcBorders>
+              <w:top w:val="single" w:color="D5D8E3" w:sz="4"/>
+              <w:left w:val="single" w:color="D5D8E3" w:sz="4"/>
+              <w:bottom w:val="single" w:color="D5D8E3" w:sz="4"/>
+              <w:right w:val="single" w:color="D5D8E3" w:sz="4"/>
+            </w:tcBorders>
+            <w:shd w:fill="E5E9FF" w:color="auto" w:val="clear"/>
+            <w:tcMar>
+              <w:top w:type="dxa" w:w="60"/>
+              <w:left w:type="dxa" w:w="100"/>
+              <w:bottom w:type="dxa" w:w="60"/>
+              <w:right w:type="dxa" w:w="100"/>
+            </w:tcMar>
+          </w:tcPr>
+          <w:p>
+            <w:pPr>
+              <w:spacing w:after="20" w:line="264"/>
+            </w:pPr>
+            <w:r>
+              <w:rPr>
+                <w:b/>
+                <w:bCs/>
+                <w:color w:val="151827"/>
+                <w:sz w:val="19"/>
+                <w:szCs w:val="19"/>
+              </w:rPr>
+              <w:t xml:space="preserve">Other friends see</w:t>
+            </w:r>
+          </w:p>
+        </w:tc>
+      </w:tr>
+      <w:tr>
+        <w:trPr>
+          <w:cantSplit/>
+          <w:tblHeader w:val="false"/>
+        </w:trPr>
+        <w:tc>
+          <w:tcPr>
+            <w:tcW w:type="dxa" w:w="2099"/>
+            <w:tcBorders>
+              <w:top w:val="single" w:color="D5D8E3" w:sz="4"/>
+              <w:left w:val="single" w:color="D5D8E3" w:sz="4"/>
+              <w:bottom w:val="single" w:color="D5D8E3" w:sz="4"/>
+              <w:right w:val="single" w:color="D5D8E3" w:sz="4"/>
+            </w:tcBorders>
+            <w:shd w:fill="FFFFFF" w:color="auto" w:val="clear"/>
+            <w:tcMar>
+              <w:top w:type="dxa" w:w="60"/>
+              <w:left w:type="dxa" w:w="100"/>
+              <w:bottom w:type="dxa" w:w="60"/>
+              <w:right w:type="dxa" w:w="100"/>
+            </w:tcMar>
+          </w:tcPr>
+          <w:p>
+            <w:pPr>
+              <w:spacing w:after="20" w:line="264"/>
+            </w:pPr>
+            <w:r>
+              <w:rPr>
+                <w:sz w:val="19"/>
+                <w:szCs w:val="19"/>
+              </w:rPr>
+              <w:t xml:space="preserve">Friends</w:t>
+            </w:r>
+          </w:p>
+        </w:tc>
+        <w:tc>
+          <w:tcPr>
+            <w:tcW w:type="dxa" w:w="3463"/>
+            <w:tcBorders>
+              <w:top w:val="single" w:color="D5D8E3" w:sz="4"/>
+              <w:left w:val="single" w:color="D5D8E3" w:sz="4"/>
+              <w:bottom w:val="single" w:color="D5D8E3" w:sz="4"/>
+              <w:right w:val="single" w:color="D5D8E3" w:sz="4"/>
+            </w:tcBorders>
+            <w:shd w:fill="FFFFFF" w:color="auto" w:val="clear"/>
+            <w:tcMar>
+              <w:top w:type="dxa" w:w="60"/>
+              <w:left w:type="dxa" w:w="100"/>
+              <w:bottom w:type="dxa" w:w="60"/>
+              <w:right w:type="dxa" w:w="100"/>
+            </w:tcMar>
+          </w:tcPr>
+          <w:p>
+            <w:pPr>
+              <w:spacing w:after="20" w:line="264"/>
+            </w:pPr>
+            <w:r>
+              <w:rPr>
+                <w:sz w:val="19"/>
+                <w:szCs w:val="19"/>
+              </w:rPr>
+              <w:t xml:space="preserve">Everything (not notes)</w:t>
+            </w:r>
+          </w:p>
+        </w:tc>
+        <w:tc>
+          <w:tcPr>
+            <w:tcW w:type="dxa" w:w="3464"/>
+            <w:tcBorders>
+              <w:top w:val="single" w:color="D5D8E3" w:sz="4"/>
+              <w:left w:val="single" w:color="D5D8E3" w:sz="4"/>
+              <w:bottom w:val="single" w:color="D5D8E3" w:sz="4"/>
+              <w:right w:val="single" w:color="D5D8E3" w:sz="4"/>
+            </w:tcBorders>
+            <w:shd w:fill="FFFFFF" w:color="auto" w:val="clear"/>
+            <w:tcMar>
+              <w:top w:type="dxa" w:w="60"/>
+              <w:left w:type="dxa" w:w="100"/>
+              <w:bottom w:type="dxa" w:w="60"/>
+              <w:right w:type="dxa" w:w="100"/>
+            </w:tcMar>
+          </w:tcPr>
+          <w:p>
+            <w:pPr>
+              <w:spacing w:after="20" w:line="264"/>
+            </w:pPr>
+            <w:r>
+              <w:rPr>
+                <w:sz w:val="19"/>
+                <w:szCs w:val="19"/>
+              </w:rPr>
+              <w:t xml:space="preserve">Everything (not notes)</w:t>
+            </w:r>
+          </w:p>
+        </w:tc>
+      </w:tr>
+      <w:tr>
+        <w:trPr>
+          <w:cantSplit/>
+          <w:tblHeader w:val="false"/>
+        </w:trPr>
+        <w:tc>
+          <w:tcPr>
+            <w:tcW w:type="dxa" w:w="2099"/>
+            <w:tcBorders>
+              <w:top w:val="single" w:color="D5D8E3" w:sz="4"/>
+              <w:left w:val="single" w:color="D5D8E3" w:sz="4"/>
+              <w:bottom w:val="single" w:color="D5D8E3" w:sz="4"/>
+              <w:right w:val="single" w:color="D5D8E3" w:sz="4"/>
+            </w:tcBorders>
+            <w:shd w:fill="FAFBFD" w:color="auto" w:val="clear"/>
+            <w:tcMar>
+              <w:top w:type="dxa" w:w="60"/>
+              <w:left w:type="dxa" w:w="100"/>
+              <w:bottom w:type="dxa" w:w="60"/>
+              <w:right w:type="dxa" w:w="100"/>
+            </w:tcMar>
+          </w:tcPr>
+          <w:p>
+            <w:pPr>
+              <w:spacing w:after="20" w:line="264"/>
+            </w:pPr>
+            <w:r>
+              <w:rPr>
+                <w:sz w:val="19"/>
+                <w:szCs w:val="19"/>
+              </w:rPr>
+              <w:t xml:space="preserve">Close</w:t>
+            </w:r>
+          </w:p>
+        </w:tc>
+        <w:tc>
+          <w:tcPr>
+            <w:tcW w:type="dxa" w:w="3463"/>
+            <w:tcBorders>
+              <w:top w:val="single" w:color="D5D8E3" w:sz="4"/>
+              <w:left w:val="single" w:color="D5D8E3" w:sz="4"/>
+              <w:bottom w:val="single" w:color="D5D8E3" w:sz="4"/>
+              <w:right w:val="single" w:color="D5D8E3" w:sz="4"/>
+            </w:tcBorders>
+            <w:shd w:fill="FAFBFD" w:color="auto" w:val="clear"/>
+            <w:tcMar>
+              <w:top w:type="dxa" w:w="60"/>
+              <w:left w:type="dxa" w:w="100"/>
+              <w:bottom w:type="dxa" w:w="60"/>
+              <w:right w:type="dxa" w:w="100"/>
+            </w:tcMar>
+          </w:tcPr>
+          <w:p>
+            <w:pPr>
+              <w:spacing w:after="20" w:line="264"/>
+            </w:pPr>
+            <w:r>
+              <w:rPr>
+                <w:sz w:val="19"/>
+                <w:szCs w:val="19"/>
+              </w:rPr>
+              <w:t xml:space="preserve">Everything (not notes)</w:t>
+            </w:r>
+          </w:p>
+        </w:tc>
+        <w:tc>
+          <w:tcPr>
+            <w:tcW w:type="dxa" w:w="3464"/>
+            <w:tcBorders>
+              <w:top w:val="single" w:color="D5D8E3" w:sz="4"/>
+              <w:left w:val="single" w:color="D5D8E3" w:sz="4"/>
+              <w:bottom w:val="single" w:color="D5D8E3" w:sz="4"/>
+              <w:right w:val="single" w:color="D5D8E3" w:sz="4"/>
+            </w:tcBorders>
+            <w:shd w:fill="FAFBFD" w:color="auto" w:val="clear"/>
+            <w:tcMar>
+              <w:top w:type="dxa" w:w="60"/>
+              <w:left w:type="dxa" w:w="100"/>
+              <w:bottom w:type="dxa" w:w="60"/>
+              <w:right w:type="dxa" w:w="100"/>
+            </w:tcMar>
+          </w:tcPr>
+          <w:p>
+            <w:pPr>
+              <w:spacing w:after="20" w:line="264"/>
+            </w:pPr>
+            <w:r>
+              <w:rPr>
+                <w:sz w:val="19"/>
+                <w:szCs w:val="19"/>
+              </w:rPr>
+              <w:t xml:space="preserve">"Busy"</w:t>
+            </w:r>
+          </w:p>
+        </w:tc>
+      </w:tr>
+      <w:tr>
+        <w:trPr>
+          <w:cantSplit/>
+          <w:tblHeader w:val="false"/>
+        </w:trPr>
+        <w:tc>
+          <w:tcPr>
+            <w:tcW w:type="dxa" w:w="2099"/>
+            <w:tcBorders>
+              <w:top w:val="single" w:color="D5D8E3" w:sz="4"/>
+              <w:left w:val="single" w:color="D5D8E3" w:sz="4"/>
+              <w:bottom w:val="single" w:color="D5D8E3" w:sz="4"/>
+              <w:right w:val="single" w:color="D5D8E3" w:sz="4"/>
+            </w:tcBorders>
+            <w:shd w:fill="FFFFFF" w:color="auto" w:val="clear"/>
+            <w:tcMar>
+              <w:top w:type="dxa" w:w="60"/>
+              <w:left w:type="dxa" w:w="100"/>
+              <w:bottom w:type="dxa" w:w="60"/>
+              <w:right w:type="dxa" w:w="100"/>
+            </w:tcMar>
+          </w:tcPr>
+          <w:p>
+            <w:pPr>
+              <w:spacing w:after="20" w:line="264"/>
+            </w:pPr>
+            <w:r>
+              <w:rPr>
+                <w:sz w:val="19"/>
+                <w:szCs w:val="19"/>
+              </w:rPr>
+              <w:t xml:space="preserve">Busy only</w:t>
+            </w:r>
+          </w:p>
+        </w:tc>
+        <w:tc>
+          <w:tcPr>
+            <w:tcW w:type="dxa" w:w="3463"/>
+            <w:tcBorders>
+              <w:top w:val="single" w:color="D5D8E3" w:sz="4"/>
+              <w:left w:val="single" w:color="D5D8E3" w:sz="4"/>
+              <w:bottom w:val="single" w:color="D5D8E3" w:sz="4"/>
+              <w:right w:val="single" w:color="D5D8E3" w:sz="4"/>
+            </w:tcBorders>
+            <w:shd w:fill="FFFFFF" w:color="auto" w:val="clear"/>
+            <w:tcMar>
+              <w:top w:type="dxa" w:w="60"/>
+              <w:left w:type="dxa" w:w="100"/>
+              <w:bottom w:type="dxa" w:w="60"/>
+              <w:right w:type="dxa" w:w="100"/>
+            </w:tcMar>
+          </w:tcPr>
+          <w:p>
+            <w:pPr>
+              <w:spacing w:after="20" w:line="264"/>
+            </w:pPr>
+            <w:r>
+              <w:rPr>
+                <w:sz w:val="19"/>
+                <w:szCs w:val="19"/>
+              </w:rPr>
+              <w:t xml:space="preserve">"Busy"</w:t>
+            </w:r>
+          </w:p>
+        </w:tc>
+        <w:tc>
+          <w:tcPr>
+            <w:tcW w:type="dxa" w:w="3464"/>
+            <w:tcBorders>
+              <w:top w:val="single" w:color="D5D8E3" w:sz="4"/>
+              <w:left w:val="single" w:color="D5D8E3" w:sz="4"/>
+              <w:bottom w:val="single" w:color="D5D8E3" w:sz="4"/>
+              <w:right w:val="single" w:color="D5D8E3" w:sz="4"/>
+            </w:tcBorders>
+            <w:shd w:fill="FFFFFF" w:color="auto" w:val="clear"/>
+            <w:tcMar>
+              <w:top w:type="dxa" w:w="60"/>
+              <w:left w:type="dxa" w:w="100"/>
+              <w:bottom w:type="dxa" w:w="60"/>
+              <w:right w:type="dxa" w:w="100"/>
+            </w:tcMar>
+          </w:tcPr>
+          <w:p>
+            <w:pPr>
+              <w:spacing w:after="20" w:line="264"/>
+            </w:pPr>
+            <w:r>
+              <w:rPr>
+                <w:sz w:val="19"/>
+                <w:szCs w:val="19"/>
+              </w:rPr>
+              <w:t xml:space="preserve">"Busy"</w:t>
+            </w:r>
+          </w:p>
+        </w:tc>
+      </w:tr>
+      <w:tr>
+        <w:trPr>
+          <w:cantSplit/>
+          <w:tblHeader w:val="false"/>
+        </w:trPr>
+        <w:tc>
+          <w:tcPr>
+            <w:tcW w:type="dxa" w:w="2099"/>
+            <w:tcBorders>
+              <w:top w:val="single" w:color="D5D8E3" w:sz="4"/>
+              <w:left w:val="single" w:color="D5D8E3" w:sz="4"/>
+              <w:bottom w:val="single" w:color="D5D8E3" w:sz="4"/>
+              <w:right w:val="single" w:color="D5D8E3" w:sz="4"/>
+            </w:tcBorders>
+            <w:shd w:fill="FAFBFD" w:color="auto" w:val="clear"/>
+            <w:tcMar>
+              <w:top w:type="dxa" w:w="60"/>
+              <w:left w:type="dxa" w:w="100"/>
+              <w:bottom w:type="dxa" w:w="60"/>
+              <w:right w:type="dxa" w:w="100"/>
+            </w:tcMar>
+          </w:tcPr>
+          <w:p>
+            <w:pPr>
+              <w:spacing w:after="20" w:line="264"/>
+            </w:pPr>
+            <w:r>
+              <w:rPr>
+                <w:sz w:val="19"/>
+                <w:szCs w:val="19"/>
+              </w:rPr>
+              <w:t xml:space="preserve">Private</w:t>
+            </w:r>
+          </w:p>
+        </w:tc>
+        <w:tc>
+          <w:tcPr>
+            <w:tcW w:type="dxa" w:w="3463"/>
+            <w:tcBorders>
+              <w:top w:val="single" w:color="D5D8E3" w:sz="4"/>
+              <w:left w:val="single" w:color="D5D8E3" w:sz="4"/>
+              <w:bottom w:val="single" w:color="D5D8E3" w:sz="4"/>
+              <w:right w:val="single" w:color="D5D8E3" w:sz="4"/>
+            </w:tcBorders>
+            <w:shd w:fill="FAFBFD" w:color="auto" w:val="clear"/>
+            <w:tcMar>
+              <w:top w:type="dxa" w:w="60"/>
+              <w:left w:type="dxa" w:w="100"/>
+              <w:bottom w:type="dxa" w:w="60"/>
+              <w:right w:type="dxa" w:w="100"/>
+            </w:tcMar>
+          </w:tcPr>
+          <w:p>
+            <w:pPr>
+              <w:spacing w:after="20" w:line="264"/>
+            </w:pPr>
+            <w:r>
+              <w:rPr>
+                <w:sz w:val="19"/>
+                <w:szCs w:val="19"/>
+              </w:rPr>
+              <w:t xml:space="preserve">Nothing</w:t>
+            </w:r>
+          </w:p>
+        </w:tc>
+        <w:tc>
+          <w:tcPr>
+            <w:tcW w:type="dxa" w:w="3464"/>
+            <w:tcBorders>
+              <w:top w:val="single" w:color="D5D8E3" w:sz="4"/>
+              <w:left w:val="single" w:color="D5D8E3" w:sz="4"/>
+              <w:bottom w:val="single" w:color="D5D8E3" w:sz="4"/>
+              <w:right w:val="single" w:color="D5D8E3" w:sz="4"/>
+            </w:tcBorders>
+            <w:shd w:fill="FAFBFD" w:color="auto" w:val="clear"/>
+            <w:tcMar>
+              <w:top w:type="dxa" w:w="60"/>
+              <w:left w:type="dxa" w:w="100"/>
+              <w:bottom w:type="dxa" w:w="60"/>
+              <w:right w:type="dxa" w:w="100"/>
+            </w:tcMar>
+          </w:tcPr>
+          <w:p>
+            <w:pPr>
+              <w:spacing w:after="20" w:line="264"/>
+            </w:pPr>
+            <w:r>
+              <w:rPr>
+                <w:sz w:val="19"/>
+                <w:szCs w:val="19"/>
+              </w:rPr>
+              <w:t xml:space="preserve">Nothing</w:t>
+            </w:r>
+          </w:p>
+        </w:tc>
+      </w:tr>
+    </w:tbl>
+    <w:p>
+      <w:pPr>
+        <w:spacing w:after="120" w:line="300"/>
+      </w:pPr>
+      <w:r>
+        <w:t xml:space="preserve">A </w:t>
+      </w:r>
+      <w:r>
+        <w:rPr>
+          <w:b/>
+          <w:bCs/>
+        </w:rPr>
+        <w:t xml:space="preserve">surprise</w:t>
+      </w:r>
+      <w:r>
+        <w:t xml:space="preserve"> adds people to the event's </w:t>
+      </w:r>
+      <w:r>
+        <w:rPr>
+          <w:rFonts w:ascii="Consolas" w:cs="Consolas" w:eastAsia="Consolas" w:hAnsi="Consolas"/>
+          <w:color w:val="1F3A93"/>
+          <w:sz w:val="19"/>
+          <w:szCs w:val="19"/>
+        </w:rPr>
+        <w:t xml:space="preserve">hidden_from</w:t>
+      </w:r>
+      <w:r>
+        <w:t xml:space="preserve"> list. They don't see it at all and can't be invited by mistake.</w:t>
+      </w:r>
+    </w:p>
+    <w:p>
+      <w:pPr>
+        <w:pStyle w:val="Heading1"/>
+        <w:pageBreakBefore/>
+      </w:pPr>
+      <w:r>
+        <w:t xml:space="preserve">13. Chat</w:t>
+      </w:r>
+    </w:p>
+    <w:p>
+      <w:pPr>
+        <w:pStyle w:val="ListParagraph"/>
+        <w:numPr>
+          <w:ilvl w:val="0"/>
+          <w:numId w:val="4"/>
+        </w:numPr>
+        <w:spacing w:after="60" w:line="288"/>
+      </w:pPr>
+      <w:r>
+        <w:t xml:space="preserve">Three kinds of chat: </w:t>
+      </w:r>
+      <w:r>
+        <w:rPr>
+          <w:b/>
+          <w:bCs/>
+        </w:rPr>
+        <w:t xml:space="preserve">direct</w:t>
+      </w:r>
+      <w:r>
+        <w:t xml:space="preserve"> (one per pair of friends), </w:t>
+      </w:r>
+      <w:r>
+        <w:rPr>
+          <w:b/>
+          <w:bCs/>
+        </w:rPr>
+        <w:t xml:space="preserve">group</w:t>
+      </w:r>
+      <w:r>
+        <w:t xml:space="preserve">, and </w:t>
+      </w:r>
+      <w:r>
+        <w:rPr>
+          <w:b/>
+          <w:bCs/>
+        </w:rPr>
+        <w:t xml:space="preserve">event</w:t>
+      </w:r>
+      <w:r>
+        <w:t xml:space="preserve"> (one per plan, for the host and guests).</w:t>
+      </w:r>
+    </w:p>
+    <w:p>
+      <w:pPr>
+        <w:pStyle w:val="ListParagraph"/>
+        <w:numPr>
+          <w:ilvl w:val="0"/>
+          <w:numId w:val="4"/>
+        </w:numPr>
+        <w:spacing w:after="60" w:line="288"/>
+      </w:pPr>
+      <w:r>
+        <w:t xml:space="preserve">Every rule starts with "</w:t>
+      </w:r>
+      <w:r>
+        <w:rPr>
+          <w:b/>
+          <w:bCs/>
+        </w:rPr>
+        <w:t xml:space="preserve">are you a member of this chat?</w:t>
+      </w:r>
+      <w:r>
+        <w:t xml:space="preserve">". Non-members can't read or post, and you can only send messages as yourself.</w:t>
+      </w:r>
+    </w:p>
+    <w:p>
+      <w:pPr>
+        <w:pStyle w:val="ListParagraph"/>
+        <w:numPr>
+          <w:ilvl w:val="0"/>
+          <w:numId w:val="4"/>
+        </w:numPr>
+        <w:spacing w:after="60" w:line="288"/>
+      </w:pPr>
+      <w:r>
+        <w:rPr>
+          <w:b/>
+          <w:bCs/>
+        </w:rPr>
+        <w:t xml:space="preserve">Blocking</w:t>
+      </w:r>
+      <w:r>
+        <w:t xml:space="preserve"> stops direct messages both ways and hides the person's notifications.</w:t>
+      </w:r>
+    </w:p>
+    <w:p>
+      <w:pPr>
+        <w:pStyle w:val="ListParagraph"/>
+        <w:numPr>
+          <w:ilvl w:val="0"/>
+          <w:numId w:val="4"/>
+        </w:numPr>
+        <w:spacing w:after="60" w:line="288"/>
+      </w:pPr>
+      <w:r>
+        <w:rPr>
+          <w:b/>
+          <w:bCs/>
+        </w:rPr>
+        <w:t xml:space="preserve">Photos</w:t>
+      </w:r>
+      <w:r>
+        <w:t xml:space="preserve"> go in a private storage bucket that only members can read. A cleanup job deletes them after 6 months, or straight away if the message is deleted.</w:t>
+      </w:r>
+    </w:p>
+    <w:p>
+      <w:pPr>
+        <w:pStyle w:val="ListParagraph"/>
+        <w:numPr>
+          <w:ilvl w:val="0"/>
+          <w:numId w:val="4"/>
+        </w:numPr>
+        <w:spacing w:after="60" w:line="288"/>
+      </w:pPr>
+      <w:r>
+        <w:rPr>
+          <w:b/>
+          <w:bCs/>
+        </w:rPr>
+        <w:t xml:space="preserve">Make an event</w:t>
+      </w:r>
+      <w:r>
+        <w:t xml:space="preserve"> from a message sends its text to Smart add, so "ball at 7 thursday" becomes a draft event.</w:t>
+      </w:r>
+    </w:p>
+    <w:p>
+      <w:pPr>
+        <w:pStyle w:val="Heading1"/>
+        <w:pageBreakBefore/>
+      </w:pPr>
+      <w:r>
+        <w:t xml:space="preserve">14. Memories and My Week</w:t>
+      </w:r>
+    </w:p>
+    <w:p>
+      <w:pPr>
+        <w:pStyle w:val="ListParagraph"/>
+        <w:numPr>
+          <w:ilvl w:val="0"/>
+          <w:numId w:val="4"/>
+        </w:numPr>
+        <w:spacing w:after="60" w:line="288"/>
+      </w:pPr>
+      <w:r>
+        <w:t xml:space="preserve">Anyone going to a plan can add photos. They're shrunk on the phone and stored in a private bucket.</w:t>
+      </w:r>
+    </w:p>
+    <w:p>
+      <w:pPr>
+        <w:pStyle w:val="ListParagraph"/>
+        <w:numPr>
+          <w:ilvl w:val="0"/>
+          <w:numId w:val="4"/>
+        </w:numPr>
+        <w:spacing w:after="60" w:line="288"/>
+      </w:pPr>
+      <w:r>
+        <w:rPr>
+          <w:rFonts w:ascii="Consolas" w:cs="Consolas" w:eastAsia="Consolas" w:hAnsi="Consolas"/>
+          <w:color w:val="1F3A93"/>
+          <w:sz w:val="19"/>
+          <w:szCs w:val="19"/>
+        </w:rPr>
+        <w:t xml:space="preserve">can_view_photo()</w:t>
+      </w:r>
+      <w:r>
+        <w:t xml:space="preserve"> decides who can see each photo: you, people who can see that event, or friends watching a week you posted.</w:t>
+      </w:r>
+    </w:p>
+    <w:p>
+      <w:pPr>
+        <w:pStyle w:val="ListParagraph"/>
+        <w:numPr>
+          <w:ilvl w:val="0"/>
+          <w:numId w:val="4"/>
+        </w:numPr>
+        <w:spacing w:after="60" w:line="288"/>
+      </w:pPr>
+      <w:r>
+        <w:rPr>
+          <w:b/>
+          <w:bCs/>
+        </w:rPr>
+        <w:t xml:space="preserve">My Week</w:t>
+      </w:r>
+      <w:r>
+        <w:t xml:space="preserve"> is built on the phone from your week's events and photos. Private and busy-only things are left out by default. Photos you hide are saved </w:t>
+      </w:r>
+      <w:r>
+        <w:rPr>
+          <w:b/>
+          <w:bCs/>
+        </w:rPr>
+        <w:t xml:space="preserve">without</w:t>
+      </w:r>
+      <w:r>
+        <w:t xml:space="preserve"> their file path, so nobody can load them even with the API.</w:t>
+      </w:r>
+    </w:p>
+    <w:p>
+      <w:pPr>
+        <w:pStyle w:val="ListParagraph"/>
+        <w:numPr>
+          <w:ilvl w:val="0"/>
+          <w:numId w:val="4"/>
+        </w:numPr>
+        <w:spacing w:after="60" w:line="288"/>
+      </w:pPr>
+      <w:r>
+        <w:rPr>
+          <w:b/>
+          <w:bCs/>
+        </w:rPr>
+        <w:t xml:space="preserve">Save image</w:t>
+      </w:r>
+      <w:r>
+        <w:t xml:space="preserve"> draws a 1080 × 1920 collage on a canvas and opens the phone's share menu.</w:t>
+      </w:r>
+    </w:p>
+    <w:p>
+      <w:pPr>
+        <w:pStyle w:val="Heading1"/>
+        <w:pageBreakBefore/>
+      </w:pPr>
+      <w:r>
+        <w:t xml:space="preserve">15. Notifications</w:t>
+      </w:r>
+    </w:p>
+    <w:p>
+      <w:pPr>
+        <w:pStyle w:val="Heading2"/>
+      </w:pPr>
+      <w:r>
+        <w:t xml:space="preserve">How a notification reaches your lock screen</w:t>
+      </w:r>
+    </w:p>
+    <w:p>
+      <w:pPr>
+        <w:pStyle w:val="ListParagraph"/>
+        <w:numPr>
+          <w:ilvl w:val="0"/>
+          <w:numId w:val="9"/>
+        </w:numPr>
+        <w:spacing w:after="60" w:line="288"/>
+      </w:pPr>
+      <w:r>
+        <w:t xml:space="preserve">When you turn notifications on, the phone gives Klander a </w:t>
+      </w:r>
+      <w:r>
+        <w:rPr>
+          <w:b/>
+          <w:bCs/>
+        </w:rPr>
+        <w:t xml:space="preserve">push subscription</w:t>
+      </w:r>
+      <w:r>
+        <w:t xml:space="preserve">: an address at Apple's or Google's push service.</w:t>
+      </w:r>
+    </w:p>
+    <w:p>
+      <w:pPr>
+        <w:pStyle w:val="ListParagraph"/>
+        <w:numPr>
+          <w:ilvl w:val="0"/>
+          <w:numId w:val="9"/>
+        </w:numPr>
+        <w:spacing w:after="60" w:line="288"/>
+      </w:pPr>
+      <w:r>
+        <w:t xml:space="preserve">Something happens (an invite, a message). A </w:t>
+      </w:r>
+      <w:r>
+        <w:rPr>
+          <w:b/>
+          <w:bCs/>
+        </w:rPr>
+        <w:t xml:space="preserve">database trigger</w:t>
+      </w:r>
+      <w:r>
+        <w:t xml:space="preserve"> writes a row in </w:t>
+      </w:r>
+      <w:r>
+        <w:rPr>
+          <w:rFonts w:ascii="Consolas" w:cs="Consolas" w:eastAsia="Consolas" w:hAnsi="Consolas"/>
+          <w:color w:val="1F3A93"/>
+          <w:sz w:val="19"/>
+          <w:szCs w:val="19"/>
+        </w:rPr>
+        <w:t xml:space="preserve">notifications</w:t>
+      </w:r>
+      <w:r>
+        <w:t xml:space="preserve">. The app never writes these rows itself.</w:t>
+      </w:r>
+    </w:p>
+    <w:p>
+      <w:pPr>
+        <w:pStyle w:val="ListParagraph"/>
+        <w:numPr>
+          <w:ilvl w:val="0"/>
+          <w:numId w:val="9"/>
+        </w:numPr>
+        <w:spacing w:after="60" w:line="288"/>
+      </w:pPr>
+      <w:r>
+        <w:t xml:space="preserve">Every minute, </w:t>
+      </w:r>
+      <w:r>
+        <w:rPr>
+          <w:b/>
+          <w:bCs/>
+        </w:rPr>
+        <w:t xml:space="preserve">pg_cron</w:t>
+      </w:r>
+      <w:r>
+        <w:t xml:space="preserve"> calls the </w:t>
+      </w:r>
+      <w:r>
+        <w:rPr>
+          <w:b/>
+          <w:bCs/>
+        </w:rPr>
+        <w:t xml:space="preserve">push</w:t>
+      </w:r>
+      <w:r>
+        <w:t xml:space="preserve"> Edge Function. It finds rows that are due, checks quiet hours and sleep after shifts, and sends each one using its </w:t>
+      </w:r>
+      <w:r>
+        <w:rPr>
+          <w:b/>
+          <w:bCs/>
+        </w:rPr>
+        <w:t xml:space="preserve">VAPID</w:t>
+      </w:r>
+      <w:r>
+        <w:t xml:space="preserve"> key (which proves it came from Klander).</w:t>
+      </w:r>
+    </w:p>
+    <w:p>
+      <w:pPr>
+        <w:pStyle w:val="ListParagraph"/>
+        <w:numPr>
+          <w:ilvl w:val="0"/>
+          <w:numId w:val="9"/>
+        </w:numPr>
+        <w:spacing w:after="60" w:line="288"/>
+      </w:pPr>
+      <w:r>
+        <w:t xml:space="preserve">Apple or Google delivers it to the phone, and the </w:t>
+      </w:r>
+      <w:r>
+        <w:rPr>
+          <w:b/>
+          <w:bCs/>
+        </w:rPr>
+        <w:t xml:space="preserve">service worker</w:t>
+      </w:r>
+      <w:r>
+        <w:t xml:space="preserve"> shows it, even with Klander closed.</w:t>
+      </w:r>
+    </w:p>
+    <w:p>
+      <w:pPr>
+        <w:pStyle w:val="ListParagraph"/>
+        <w:numPr>
+          <w:ilvl w:val="0"/>
+          <w:numId w:val="4"/>
+        </w:numPr>
+        <w:spacing w:after="60" w:line="288"/>
+      </w:pPr>
+      <w:r>
+        <w:rPr>
+          <w:b/>
+          <w:bCs/>
+        </w:rPr>
+        <w:t xml:space="preserve">Grouping:</w:t>
+      </w:r>
+      <w:r>
+        <w:t xml:space="preserve"> friend-event alerts wait 3 minutes, so five quick edits make one notification.</w:t>
+      </w:r>
+    </w:p>
+    <w:p>
+      <w:pPr>
+        <w:pStyle w:val="ListParagraph"/>
+        <w:numPr>
+          <w:ilvl w:val="0"/>
+          <w:numId w:val="4"/>
+        </w:numPr>
+        <w:spacing w:after="60" w:line="288"/>
+      </w:pPr>
+      <w:r>
+        <w:rPr>
+          <w:b/>
+          <w:bCs/>
+        </w:rPr>
+        <w:t xml:space="preserve">Reminders</w:t>
+      </w:r>
+      <w:r>
+        <w:t xml:space="preserve"> come from the event, then its category, then your default. Each gets a unique </w:t>
+      </w:r>
+      <w:r>
+        <w:rPr>
+          <w:rFonts w:ascii="Consolas" w:cs="Consolas" w:eastAsia="Consolas" w:hAnsi="Consolas"/>
+          <w:color w:val="1F3A93"/>
+          <w:sz w:val="19"/>
+          <w:szCs w:val="19"/>
+        </w:rPr>
+        <w:t xml:space="preserve">dedupe_key</w:t>
+      </w:r>
+      <w:r>
+        <w:t xml:space="preserve">, so it can never be sent twice.</w:t>
+      </w:r>
+    </w:p>
+    <w:p>
+      <w:pPr>
+        <w:pStyle w:val="ListParagraph"/>
+        <w:numPr>
+          <w:ilvl w:val="0"/>
+          <w:numId w:val="4"/>
+        </w:numPr>
+        <w:spacing w:after="60" w:line="288"/>
+      </w:pPr>
+      <w:r>
+        <w:rPr>
+          <w:b/>
+          <w:bCs/>
+        </w:rPr>
+        <w:t xml:space="preserve">iPhone:</w:t>
+      </w:r>
+      <w:r>
+        <w:t xml:space="preserve"> Apple only allows this for web apps added to the Home Screen, which is why there's an install guide.</w:t>
+      </w:r>
+    </w:p>
+    <w:p>
+      <w:pPr>
+        <w:pBdr>
+          <w:left w:val="single" w:color="2B4CFF" w:sz="18" w:space="8"/>
+        </w:pBdr>
+        <w:shd w:fill="EEF1FF" w:color="auto" w:val="clear"/>
+        <w:spacing w:after="160" w:before="80" w:line="288"/>
+        <w:ind w:left="160" w:right="160"/>
+      </w:pPr>
+      <w:r>
+        <w:rPr>
+          <w:b/>
+          <w:bCs/>
+          <w:sz w:val="20"/>
+          <w:szCs w:val="20"/>
+        </w:rPr>
+        <w:t xml:space="preserve">Best bug story:</w:t>
+      </w:r>
+      <w:r>
+        <w:rPr>
+          <w:sz w:val="20"/>
+          <w:szCs w:val="20"/>
+        </w:rPr>
+        <w:t xml:space="preserve"> reminders passed every mock test but were never created on the real server. The "only once" rule used a partial index that Postgres can't use for upserts, so every insert silently did nothing. A live test on my own phone found it, and a unique </w:t>
+      </w:r>
+      <w:r>
+        <w:rPr>
+          <w:rFonts w:ascii="Consolas" w:cs="Consolas" w:eastAsia="Consolas" w:hAnsi="Consolas"/>
+          <w:color w:val="1F3A93"/>
+          <w:sz w:val="20"/>
+          <w:szCs w:val="20"/>
+        </w:rPr>
+        <w:t xml:space="preserve">dedupe_key</w:t>
+      </w:r>
+      <w:r>
+        <w:rPr>
+          <w:sz w:val="20"/>
+          <w:szCs w:val="20"/>
+        </w:rPr>
+        <w:t xml:space="preserve"> fixed it.</w:t>
+      </w:r>
+    </w:p>
+    <w:p>
+      <w:pPr>
+        <w:pStyle w:val="Heading1"/>
+        <w:pageBreakBefore/>
+      </w:pPr>
+      <w:r>
+        <w:t xml:space="preserve">16. Shifts, family link and quicker editing</w:t>
+      </w:r>
+    </w:p>
+    <w:p>
+      <w:pPr>
+        <w:pStyle w:val="ListParagraph"/>
+        <w:numPr>
+          <w:ilvl w:val="0"/>
+          <w:numId w:val="4"/>
+        </w:numPr>
+        <w:spacing w:after="60" w:line="288"/>
+      </w:pPr>
+      <w:r>
+        <w:rPr>
+          <w:b/>
+          <w:bCs/>
+        </w:rPr>
+        <w:t xml:space="preserve">Shifts:</w:t>
+      </w:r>
+      <w:r>
+        <w:t xml:space="preserve"> mark a category as shifts and every shift gets a Sleep block afterwards (7 hours by default). It's calculated from each occurrence, so it's still right after the clocks change.</w:t>
+      </w:r>
+    </w:p>
+    <w:p>
+      <w:pPr>
+        <w:pStyle w:val="ListParagraph"/>
+        <w:numPr>
+          <w:ilvl w:val="0"/>
+          <w:numId w:val="4"/>
+        </w:numPr>
+        <w:spacing w:after="60" w:line="288"/>
+      </w:pPr>
+      <w:r>
+        <w:t xml:space="preserve">Friends' sleep counts as busy in the free-time finder, and notifications can wait until you're awake.</w:t>
+      </w:r>
+    </w:p>
+    <w:p>
+      <w:pPr>
+        <w:pStyle w:val="ListParagraph"/>
+        <w:numPr>
+          <w:ilvl w:val="0"/>
+          <w:numId w:val="4"/>
+        </w:numPr>
+        <w:spacing w:after="60" w:line="288"/>
+      </w:pPr>
+      <w:r>
+        <w:rPr>
+          <w:b/>
+          <w:bCs/>
+        </w:rPr>
+        <w:t xml:space="preserve">Family link:</w:t>
+      </w:r>
+      <w:r>
+        <w:t xml:space="preserve"> a second secret calendar link. Friends events show in full, Close and Busy-only show as "Busy", Private never appears, and notes are never included.</w:t>
+      </w:r>
+    </w:p>
+    <w:p>
+      <w:pPr>
+        <w:pStyle w:val="ListParagraph"/>
+        <w:numPr>
+          <w:ilvl w:val="0"/>
+          <w:numId w:val="4"/>
+        </w:numPr>
+        <w:spacing w:after="60" w:line="288"/>
+      </w:pPr>
+      <w:r>
+        <w:rPr>
+          <w:b/>
+          <w:bCs/>
+        </w:rPr>
+        <w:t xml:space="preserve">Morning brief:</w:t>
+      </w:r>
+      <w:r>
+        <w:t xml:space="preserve"> an optional daily notification with your day, birthdays and who's free tonight.</w:t>
+      </w:r>
+    </w:p>
+    <w:p>
+      <w:pPr>
+        <w:pStyle w:val="ListParagraph"/>
+        <w:numPr>
+          <w:ilvl w:val="0"/>
+          <w:numId w:val="4"/>
+        </w:numPr>
+        <w:spacing w:after="60" w:line="288"/>
+      </w:pPr>
+      <w:r>
+        <w:rPr>
+          <w:b/>
+          <w:bCs/>
+        </w:rPr>
+        <w:t xml:space="preserve">Change by typing:</w:t>
+      </w:r>
+      <w:r>
+        <w:t xml:space="preserve"> "move gym to 7" goes to Smart add in edit mode, which returns a proposed change that you approve. Moving a date on a repeating event skips that one occurrence and adds a moved copy.</w:t>
+      </w:r>
+    </w:p>
+    <w:p>
+      <w:pPr>
+        <w:pStyle w:val="ListParagraph"/>
+        <w:numPr>
+          <w:ilvl w:val="0"/>
+          <w:numId w:val="4"/>
+        </w:numPr>
+        <w:spacing w:after="60" w:line="288"/>
+      </w:pPr>
+      <w:r>
+        <w:rPr>
+          <w:b/>
+          <w:bCs/>
+        </w:rPr>
+        <w:t xml:space="preserve">Clash warnings</w:t>
+      </w:r>
+      <w:r>
+        <w:t xml:space="preserve"> and </w:t>
+      </w:r>
+      <w:r>
+        <w:rPr>
+          <w:b/>
+          <w:bCs/>
+        </w:rPr>
+        <w:t xml:space="preserve">Undo</w:t>
+      </w:r>
+      <w:r>
+        <w:t xml:space="preserve"> after deleting (the deleted event and its guest list are kept for 6 seconds so they can be put back).</w:t>
+      </w:r>
+    </w:p>
+    <w:p>
+      <w:pPr>
+        <w:pStyle w:val="ListParagraph"/>
+        <w:numPr>
+          <w:ilvl w:val="0"/>
+          <w:numId w:val="4"/>
+        </w:numPr>
+        <w:spacing w:after="60" w:line="288"/>
+      </w:pPr>
+      <w:r>
+        <w:rPr>
+          <w:b/>
+          <w:bCs/>
+        </w:rPr>
+        <w:t xml:space="preserve">Why no two-way Apple sync?</w:t>
+      </w:r>
+      <w:r>
+        <w:t xml:space="preserve"> It would need an Apple app-specific password, which can read every iCloud calendar. I decided that was too much risk; the family link covers the real need.</w:t>
+      </w:r>
+    </w:p>
+    <w:p>
+      <w:pPr>
+        <w:pStyle w:val="Heading1"/>
+        <w:pageBreakBefore/>
+      </w:pPr>
+      <w:r>
+        <w:t xml:space="preserve">17. Insights</w:t>
+      </w:r>
+    </w:p>
+    <w:p>
+      <w:pPr>
+        <w:pStyle w:val="ListParagraph"/>
+        <w:numPr>
+          <w:ilvl w:val="0"/>
+          <w:numId w:val="4"/>
+        </w:numPr>
+        <w:spacing w:after="60" w:line="288"/>
+      </w:pPr>
+      <w:r>
+        <w:t xml:space="preserve">Everything on the Insights page is worked out </w:t>
+      </w:r>
+      <w:r>
+        <w:rPr>
+          <w:b/>
+          <w:bCs/>
+        </w:rPr>
+        <w:t xml:space="preserve">on your phone</w:t>
+      </w:r>
+      <w:r>
+        <w:t xml:space="preserve"> from your own events. Only you see it.</w:t>
+      </w:r>
+    </w:p>
+    <w:p>
+      <w:pPr>
+        <w:pStyle w:val="ListParagraph"/>
+        <w:numPr>
+          <w:ilvl w:val="0"/>
+          <w:numId w:val="4"/>
+        </w:numPr>
+        <w:spacing w:after="60" w:line="288"/>
+      </w:pPr>
+      <w:r>
+        <w:rPr>
+          <w:b/>
+          <w:bCs/>
+        </w:rPr>
+        <w:t xml:space="preserve">Streaks:</w:t>
+      </w:r>
+      <w:r>
+        <w:t xml:space="preserve"> weeks in a row with at least one event in a category. If this week hasn't had one yet, it counts from last week, so a streak doesn't "break" on Monday morning. Shifts don't count.</w:t>
+      </w:r>
+    </w:p>
+    <w:p>
+      <w:pPr>
+        <w:pStyle w:val="ListParagraph"/>
+        <w:numPr>
+          <w:ilvl w:val="0"/>
+          <w:numId w:val="4"/>
+        </w:numPr>
+        <w:spacing w:after="60" w:line="288"/>
+      </w:pPr>
+      <w:r>
+        <w:rPr>
+          <w:b/>
+          <w:bCs/>
+        </w:rPr>
+        <w:t xml:space="preserve">Who you made plans with:</w:t>
+      </w:r>
+      <w:r>
+        <w:t xml:space="preserve"> </w:t>
+      </w:r>
+      <w:r>
+        <w:rPr>
+          <w:rFonts w:ascii="Consolas" w:cs="Consolas" w:eastAsia="Consolas" w:hAnsi="Consolas"/>
+          <w:color w:val="1F3A93"/>
+          <w:sz w:val="19"/>
+          <w:szCs w:val="19"/>
+        </w:rPr>
+        <w:t xml:space="preserve">hangout_counts()</w:t>
+      </w:r>
+      <w:r>
+        <w:t xml:space="preserve"> counts plans you and a friend both went to. It only ever returns counts involving you, skips blocked people and returns nothing to strangers.</w:t>
+      </w:r>
+    </w:p>
+    <w:p>
+      <w:pPr>
+        <w:pStyle w:val="ListParagraph"/>
+        <w:numPr>
+          <w:ilvl w:val="0"/>
+          <w:numId w:val="4"/>
+        </w:numPr>
+        <w:spacing w:after="60" w:line="288"/>
+      </w:pPr>
+      <w:r>
+        <w:rPr>
+          <w:b/>
+          <w:bCs/>
+        </w:rPr>
+        <w:t xml:space="preserve">Wrapped:</w:t>
+      </w:r>
+      <w:r>
+        <w:t xml:space="preserve"> at the end of each term, a story of your top category, your number one friend, a favourite photo, your longest streak and your busiest week.</w:t>
+      </w:r>
+    </w:p>
+    <w:p>
+      <w:pPr>
+        <w:pStyle w:val="Heading1"/>
+        <w:pageBreakBefore/>
+      </w:pPr>
+      <w:r>
+        <w:t xml:space="preserve">18. Helping new people</w:t>
+      </w:r>
+    </w:p>
+    <w:p>
+      <w:pPr>
+        <w:pStyle w:val="ListParagraph"/>
+        <w:numPr>
+          <w:ilvl w:val="0"/>
+          <w:numId w:val="4"/>
+        </w:numPr>
+        <w:spacing w:after="60" w:line="288"/>
+      </w:pPr>
+      <w:r>
+        <w:rPr>
+          <w:b/>
+          <w:bCs/>
+        </w:rPr>
+        <w:t xml:space="preserve">Welcome tour:</w:t>
+      </w:r>
+      <w:r>
+        <w:t xml:space="preserve"> six slides the first time you open the app.</w:t>
+      </w:r>
+    </w:p>
+    <w:p>
+      <w:pPr>
+        <w:pStyle w:val="ListParagraph"/>
+        <w:numPr>
+          <w:ilvl w:val="0"/>
+          <w:numId w:val="4"/>
+        </w:numPr>
+        <w:spacing w:after="60" w:line="288"/>
+      </w:pPr>
+      <w:r>
+        <w:rPr>
+          <w:b/>
+          <w:bCs/>
+        </w:rPr>
+        <w:t xml:space="preserve">Help &amp; tips:</w:t>
+      </w:r>
+      <w:r>
+        <w:t xml:space="preserve"> searchable, and each tip has a "Show me" button that opens the right screen. It lives in </w:t>
+      </w:r>
+      <w:r>
+        <w:rPr>
+          <w:rFonts w:ascii="Consolas" w:cs="Consolas" w:eastAsia="Consolas" w:hAnsi="Consolas"/>
+          <w:color w:val="1F3A93"/>
+          <w:sz w:val="19"/>
+          <w:szCs w:val="19"/>
+        </w:rPr>
+        <w:t xml:space="preserve">src/lib/help.js</w:t>
+      </w:r>
+      <w:r>
+        <w:t xml:space="preserve">, which gets updated with every feature.</w:t>
+      </w:r>
+    </w:p>
+    <w:p>
+      <w:pPr>
+        <w:pStyle w:val="ListParagraph"/>
+        <w:numPr>
+          <w:ilvl w:val="0"/>
+          <w:numId w:val="4"/>
+        </w:numPr>
+        <w:spacing w:after="60" w:line="288"/>
+      </w:pPr>
+      <w:r>
+        <w:rPr>
+          <w:b/>
+          <w:bCs/>
+        </w:rPr>
+        <w:t xml:space="preserve">Add to Home Screen guide:</w:t>
+      </w:r>
+      <w:r>
+        <w:t xml:space="preserve"> detects iPhone, Android or computer and shows drawn steps. On Android it can offer a one-tap Install button (the browser's </w:t>
+      </w:r>
+      <w:r>
+        <w:rPr>
+          <w:rFonts w:ascii="Consolas" w:cs="Consolas" w:eastAsia="Consolas" w:hAnsi="Consolas"/>
+          <w:color w:val="1F3A93"/>
+          <w:sz w:val="19"/>
+          <w:szCs w:val="19"/>
+        </w:rPr>
+        <w:t xml:space="preserve">beforeinstallprompt</w:t>
+      </w:r>
+      <w:r>
+        <w:t xml:space="preserve"> event). It reminds iPhone users to sign in again, because the Home Screen app keeps its own sign-in.</w:t>
+      </w:r>
+    </w:p>
+    <w:p>
+      <w:pPr>
+        <w:pStyle w:val="Heading1"/>
+        <w:pageBreakBefore/>
+      </w:pPr>
+      <w:r>
+        <w:t xml:space="preserve">19. Hosting, deploying and secrets</w:t>
       </w:r>
     </w:p>
     <w:tbl>
@@ -3833,6 +6249,198 @@
                 <w:sz w:val="19"/>
                 <w:szCs w:val="19"/>
               </w:rPr>
+              <w:t xml:space="preserve">Push keys (VAPID)</w:t>
+            </w:r>
+          </w:p>
+        </w:tc>
+        <w:tc>
+          <w:tcPr>
+            <w:tcW w:type="dxa" w:w="3359"/>
+            <w:tcBorders>
+              <w:top w:val="single" w:color="D5D8E3" w:sz="4"/>
+              <w:left w:val="single" w:color="D5D8E3" w:sz="4"/>
+              <w:bottom w:val="single" w:color="D5D8E3" w:sz="4"/>
+              <w:right w:val="single" w:color="D5D8E3" w:sz="4"/>
+            </w:tcBorders>
+            <w:shd w:fill="FFFFFF" w:color="auto" w:val="clear"/>
+            <w:tcMar>
+              <w:top w:type="dxa" w:w="60"/>
+              <w:left w:type="dxa" w:w="100"/>
+              <w:bottom w:type="dxa" w:w="60"/>
+              <w:right w:type="dxa" w:w="100"/>
+            </w:tcMar>
+          </w:tcPr>
+          <w:p>
+            <w:pPr>
+              <w:spacing w:after="20" w:line="264"/>
+            </w:pPr>
+            <w:r>
+              <w:rPr>
+                <w:sz w:val="19"/>
+                <w:szCs w:val="19"/>
+              </w:rPr>
+              <w:t xml:space="preserve">private.app_secrets in the database</w:t>
+            </w:r>
+          </w:p>
+        </w:tc>
+        <w:tc>
+          <w:tcPr>
+            <w:tcW w:type="dxa" w:w="3568"/>
+            <w:tcBorders>
+              <w:top w:val="single" w:color="D5D8E3" w:sz="4"/>
+              <w:left w:val="single" w:color="D5D8E3" w:sz="4"/>
+              <w:bottom w:val="single" w:color="D5D8E3" w:sz="4"/>
+              <w:right w:val="single" w:color="D5D8E3" w:sz="4"/>
+            </w:tcBorders>
+            <w:shd w:fill="FFFFFF" w:color="auto" w:val="clear"/>
+            <w:tcMar>
+              <w:top w:type="dxa" w:w="60"/>
+              <w:left w:type="dxa" w:w="100"/>
+              <w:bottom w:type="dxa" w:w="60"/>
+              <w:right w:type="dxa" w:w="100"/>
+            </w:tcMar>
+          </w:tcPr>
+          <w:p>
+            <w:pPr>
+              <w:spacing w:after="20" w:line="264"/>
+            </w:pPr>
+            <w:r>
+              <w:rPr>
+                <w:sz w:val="19"/>
+                <w:szCs w:val="19"/>
+              </w:rPr>
+              <w:t xml:space="preserve">Made by the push function on first run; the private half never leaves the server</w:t>
+            </w:r>
+          </w:p>
+        </w:tc>
+      </w:tr>
+      <w:tr>
+        <w:trPr>
+          <w:cantSplit/>
+          <w:tblHeader w:val="false"/>
+        </w:trPr>
+        <w:tc>
+          <w:tcPr>
+            <w:tcW w:type="dxa" w:w="2099"/>
+            <w:tcBorders>
+              <w:top w:val="single" w:color="D5D8E3" w:sz="4"/>
+              <w:left w:val="single" w:color="D5D8E3" w:sz="4"/>
+              <w:bottom w:val="single" w:color="D5D8E3" w:sz="4"/>
+              <w:right w:val="single" w:color="D5D8E3" w:sz="4"/>
+            </w:tcBorders>
+            <w:shd w:fill="FAFBFD" w:color="auto" w:val="clear"/>
+            <w:tcMar>
+              <w:top w:type="dxa" w:w="60"/>
+              <w:left w:type="dxa" w:w="100"/>
+              <w:bottom w:type="dxa" w:w="60"/>
+              <w:right w:type="dxa" w:w="100"/>
+            </w:tcMar>
+          </w:tcPr>
+          <w:p>
+            <w:pPr>
+              <w:spacing w:after="20" w:line="264"/>
+            </w:pPr>
+            <w:r>
+              <w:rPr>
+                <w:sz w:val="19"/>
+                <w:szCs w:val="19"/>
+              </w:rPr>
+              <w:t xml:space="preserve">Scheduled jobs</w:t>
+            </w:r>
+          </w:p>
+        </w:tc>
+        <w:tc>
+          <w:tcPr>
+            <w:tcW w:type="dxa" w:w="3359"/>
+            <w:tcBorders>
+              <w:top w:val="single" w:color="D5D8E3" w:sz="4"/>
+              <w:left w:val="single" w:color="D5D8E3" w:sz="4"/>
+              <w:bottom w:val="single" w:color="D5D8E3" w:sz="4"/>
+              <w:right w:val="single" w:color="D5D8E3" w:sz="4"/>
+            </w:tcBorders>
+            <w:shd w:fill="FAFBFD" w:color="auto" w:val="clear"/>
+            <w:tcMar>
+              <w:top w:type="dxa" w:w="60"/>
+              <w:left w:type="dxa" w:w="100"/>
+              <w:bottom w:type="dxa" w:w="60"/>
+              <w:right w:type="dxa" w:w="100"/>
+            </w:tcMar>
+          </w:tcPr>
+          <w:p>
+            <w:pPr>
+              <w:spacing w:after="20" w:line="264"/>
+            </w:pPr>
+            <w:r>
+              <w:rPr>
+                <w:sz w:val="19"/>
+                <w:szCs w:val="19"/>
+              </w:rPr>
+              <w:t xml:space="preserve">pg_cron in Supabase</w:t>
+            </w:r>
+          </w:p>
+        </w:tc>
+        <w:tc>
+          <w:tcPr>
+            <w:tcW w:type="dxa" w:w="3568"/>
+            <w:tcBorders>
+              <w:top w:val="single" w:color="D5D8E3" w:sz="4"/>
+              <w:left w:val="single" w:color="D5D8E3" w:sz="4"/>
+              <w:bottom w:val="single" w:color="D5D8E3" w:sz="4"/>
+              <w:right w:val="single" w:color="D5D8E3" w:sz="4"/>
+            </w:tcBorders>
+            <w:shd w:fill="FAFBFD" w:color="auto" w:val="clear"/>
+            <w:tcMar>
+              <w:top w:type="dxa" w:w="60"/>
+              <w:left w:type="dxa" w:w="100"/>
+              <w:bottom w:type="dxa" w:w="60"/>
+              <w:right w:type="dxa" w:w="100"/>
+            </w:tcMar>
+          </w:tcPr>
+          <w:p>
+            <w:pPr>
+              <w:spacing w:after="20" w:line="264"/>
+            </w:pPr>
+            <w:r>
+              <w:rPr>
+                <w:sz w:val="19"/>
+                <w:szCs w:val="19"/>
+              </w:rPr>
+              <w:t xml:space="preserve">push every minute, links every 3 h, cleanup 03:17 daily, week-ready Sundays</w:t>
+            </w:r>
+          </w:p>
+        </w:tc>
+      </w:tr>
+      <w:tr>
+        <w:trPr>
+          <w:cantSplit/>
+          <w:tblHeader w:val="false"/>
+        </w:trPr>
+        <w:tc>
+          <w:tcPr>
+            <w:tcW w:type="dxa" w:w="2099"/>
+            <w:tcBorders>
+              <w:top w:val="single" w:color="D5D8E3" w:sz="4"/>
+              <w:left w:val="single" w:color="D5D8E3" w:sz="4"/>
+              <w:bottom w:val="single" w:color="D5D8E3" w:sz="4"/>
+              <w:right w:val="single" w:color="D5D8E3" w:sz="4"/>
+            </w:tcBorders>
+            <w:shd w:fill="FFFFFF" w:color="auto" w:val="clear"/>
+            <w:tcMar>
+              <w:top w:type="dxa" w:w="60"/>
+              <w:left w:type="dxa" w:w="100"/>
+              <w:bottom w:type="dxa" w:w="60"/>
+              <w:right w:type="dxa" w:w="100"/>
+            </w:tcMar>
+          </w:tcPr>
+          <w:p>
+            <w:pPr>
+              <w:spacing w:after="20" w:line="264"/>
+            </w:pPr>
+            <w:r>
+              <w:rPr>
+                <w:sz w:val="19"/>
+                <w:szCs w:val="19"/>
+              </w:rPr>
               <w:t xml:space="preserve">Google sign-in</w:t>
             </w:r>
           </w:p>
@@ -3920,7 +6528,7 @@
         <w:pageBreakBefore/>
       </w:pPr>
       <w:r>
-        <w:t xml:space="preserve">11. Where things are in the code</w:t>
+        <w:t xml:space="preserve">20. Where things are in the code</w:t>
       </w:r>
     </w:p>
     <w:tbl>
@@ -4666,7 +7274,7 @@
                 <w:sz w:val="19"/>
                 <w:szCs w:val="19"/>
               </w:rPr>
-              <w:t xml:space="preserve">Photo shrinking, calling smart add, turning drafts into events</w:t>
+              <w:t xml:space="preserve">Photo shrinking, calling smart add, turning drafts into events, edit by sentence</w:t>
             </w:r>
           </w:p>
         </w:tc>
@@ -4702,7 +7310,7 @@
                 <w:sz w:val="19"/>
                 <w:szCs w:val="19"/>
               </w:rPr>
-              <w:t xml:space="preserve">src/styles/app.css</w:t>
+              <w:t xml:space="preserve">src/lib/themes.js · birthdays.js</w:t>
             </w:r>
           </w:p>
         </w:tc>
@@ -4732,7 +7340,7 @@
                 <w:sz w:val="19"/>
                 <w:szCs w:val="19"/>
               </w:rPr>
-              <w:t xml:space="preserve">All styling, light and dark colour tokens</w:t>
+              <w:t xml:space="preserve">Themes, contrast guard, theme codes, photo themes; birthdays and UK dates</w:t>
             </w:r>
           </w:p>
         </w:tc>
@@ -4768,7 +7376,7 @@
                 <w:sz w:val="19"/>
                 <w:szCs w:val="19"/>
               </w:rPr>
-              <w:t xml:space="preserve">supabase/functions/</w:t>
+              <w:t xml:space="preserve">src/lib/freetime.js · plans.js · social.js</w:t>
             </w:r>
           </w:p>
         </w:tc>
@@ -4798,7 +7406,7 @@
                 <w:sz w:val="19"/>
                 <w:szCs w:val="19"/>
               </w:rPr>
-              <w:t xml:space="preserve">import-ics, feed, smart-add, and the shared .ics parser</w:t>
+              <w:t xml:space="preserve">Free-time finder; invites, broadcasts; close friends, groups, polls</w:t>
             </w:r>
           </w:p>
         </w:tc>
@@ -4834,7 +7442,7 @@
                 <w:sz w:val="19"/>
                 <w:szCs w:val="19"/>
               </w:rPr>
-              <w:t xml:space="preserve">supabase/schema.sql</w:t>
+              <w:t xml:space="preserve">src/lib/chat.js</w:t>
             </w:r>
           </w:p>
         </w:tc>
@@ -4864,7 +7472,7 @@
                 <w:sz w:val="19"/>
                 <w:szCs w:val="19"/>
               </w:rPr>
-              <w:t xml:space="preserve">The whole database structure and security rules</w:t>
+              <w:t xml:space="preserve">Chats, messages, reactions, photo shrinking for chat</w:t>
             </w:r>
           </w:p>
         </w:tc>
@@ -4900,6 +7508,534 @@
                 <w:sz w:val="19"/>
                 <w:szCs w:val="19"/>
               </w:rPr>
+              <w:t xml:space="preserve">src/lib/memories.js · week.js</w:t>
+            </w:r>
+          </w:p>
+        </w:tc>
+        <w:tc>
+          <w:tcPr>
+            <w:tcW w:type="dxa" w:w="6087"/>
+            <w:tcBorders>
+              <w:top w:val="single" w:color="D5D8E3" w:sz="4"/>
+              <w:left w:val="single" w:color="D5D8E3" w:sz="4"/>
+              <w:bottom w:val="single" w:color="D5D8E3" w:sz="4"/>
+              <w:right w:val="single" w:color="D5D8E3" w:sz="4"/>
+            </w:tcBorders>
+            <w:shd w:fill="FAFBFD" w:color="auto" w:val="clear"/>
+            <w:tcMar>
+              <w:top w:type="dxa" w:w="60"/>
+              <w:left w:type="dxa" w:w="100"/>
+              <w:bottom w:type="dxa" w:w="60"/>
+              <w:right w:type="dxa" w:w="100"/>
+            </w:tcMar>
+          </w:tcPr>
+          <w:p>
+            <w:pPr>
+              <w:spacing w:after="20" w:line="264"/>
+            </w:pPr>
+            <w:r>
+              <w:rPr>
+                <w:sz w:val="19"/>
+                <w:szCs w:val="19"/>
+              </w:rPr>
+              <w:t xml:space="preserve">Event photos, My Week builder, friends' weeks, One year ago</w:t>
+            </w:r>
+          </w:p>
+        </w:tc>
+      </w:tr>
+      <w:tr>
+        <w:trPr>
+          <w:cantSplit/>
+          <w:tblHeader w:val="false"/>
+        </w:trPr>
+        <w:tc>
+          <w:tcPr>
+            <w:tcW w:type="dxa" w:w="2939"/>
+            <w:tcBorders>
+              <w:top w:val="single" w:color="D5D8E3" w:sz="4"/>
+              <w:left w:val="single" w:color="D5D8E3" w:sz="4"/>
+              <w:bottom w:val="single" w:color="D5D8E3" w:sz="4"/>
+              <w:right w:val="single" w:color="D5D8E3" w:sz="4"/>
+            </w:tcBorders>
+            <w:shd w:fill="FFFFFF" w:color="auto" w:val="clear"/>
+            <w:tcMar>
+              <w:top w:type="dxa" w:w="60"/>
+              <w:left w:type="dxa" w:w="100"/>
+              <w:bottom w:type="dxa" w:w="60"/>
+              <w:right w:type="dxa" w:w="100"/>
+            </w:tcMar>
+          </w:tcPr>
+          <w:p>
+            <w:pPr>
+              <w:spacing w:after="20" w:line="264"/>
+            </w:pPr>
+            <w:r>
+              <w:rPr>
+                <w:sz w:val="19"/>
+                <w:szCs w:val="19"/>
+              </w:rPr>
+              <w:t xml:space="preserve">src/lib/notify.js · sleep.js</w:t>
+            </w:r>
+          </w:p>
+        </w:tc>
+        <w:tc>
+          <w:tcPr>
+            <w:tcW w:type="dxa" w:w="6087"/>
+            <w:tcBorders>
+              <w:top w:val="single" w:color="D5D8E3" w:sz="4"/>
+              <w:left w:val="single" w:color="D5D8E3" w:sz="4"/>
+              <w:bottom w:val="single" w:color="D5D8E3" w:sz="4"/>
+              <w:right w:val="single" w:color="D5D8E3" w:sz="4"/>
+            </w:tcBorders>
+            <w:shd w:fill="FFFFFF" w:color="auto" w:val="clear"/>
+            <w:tcMar>
+              <w:top w:type="dxa" w:w="60"/>
+              <w:left w:type="dxa" w:w="100"/>
+              <w:bottom w:type="dxa" w:w="60"/>
+              <w:right w:type="dxa" w:w="100"/>
+            </w:tcMar>
+          </w:tcPr>
+          <w:p>
+            <w:pPr>
+              <w:spacing w:after="20" w:line="264"/>
+            </w:pPr>
+            <w:r>
+              <w:rPr>
+                <w:sz w:val="19"/>
+                <w:szCs w:val="19"/>
+              </w:rPr>
+              <w:t xml:space="preserve">Notifications and settings; sleep blocks after shifts</w:t>
+            </w:r>
+          </w:p>
+        </w:tc>
+      </w:tr>
+      <w:tr>
+        <w:trPr>
+          <w:cantSplit/>
+          <w:tblHeader w:val="false"/>
+        </w:trPr>
+        <w:tc>
+          <w:tcPr>
+            <w:tcW w:type="dxa" w:w="2939"/>
+            <w:tcBorders>
+              <w:top w:val="single" w:color="D5D8E3" w:sz="4"/>
+              <w:left w:val="single" w:color="D5D8E3" w:sz="4"/>
+              <w:bottom w:val="single" w:color="D5D8E3" w:sz="4"/>
+              <w:right w:val="single" w:color="D5D8E3" w:sz="4"/>
+            </w:tcBorders>
+            <w:shd w:fill="FAFBFD" w:color="auto" w:val="clear"/>
+            <w:tcMar>
+              <w:top w:type="dxa" w:w="60"/>
+              <w:left w:type="dxa" w:w="100"/>
+              <w:bottom w:type="dxa" w:w="60"/>
+              <w:right w:type="dxa" w:w="100"/>
+            </w:tcMar>
+          </w:tcPr>
+          <w:p>
+            <w:pPr>
+              <w:spacing w:after="20" w:line="264"/>
+            </w:pPr>
+            <w:r>
+              <w:rPr>
+                <w:sz w:val="19"/>
+                <w:szCs w:val="19"/>
+              </w:rPr>
+              <w:t xml:space="preserve">src/lib/insights.js</w:t>
+            </w:r>
+          </w:p>
+        </w:tc>
+        <w:tc>
+          <w:tcPr>
+            <w:tcW w:type="dxa" w:w="6087"/>
+            <w:tcBorders>
+              <w:top w:val="single" w:color="D5D8E3" w:sz="4"/>
+              <w:left w:val="single" w:color="D5D8E3" w:sz="4"/>
+              <w:bottom w:val="single" w:color="D5D8E3" w:sz="4"/>
+              <w:right w:val="single" w:color="D5D8E3" w:sz="4"/>
+            </w:tcBorders>
+            <w:shd w:fill="FAFBFD" w:color="auto" w:val="clear"/>
+            <w:tcMar>
+              <w:top w:type="dxa" w:w="60"/>
+              <w:left w:type="dxa" w:w="100"/>
+              <w:bottom w:type="dxa" w:w="60"/>
+              <w:right w:type="dxa" w:w="100"/>
+            </w:tcMar>
+          </w:tcPr>
+          <w:p>
+            <w:pPr>
+              <w:spacing w:after="20" w:line="264"/>
+            </w:pPr>
+            <w:r>
+              <w:rPr>
+                <w:sz w:val="19"/>
+                <w:szCs w:val="19"/>
+              </w:rPr>
+              <w:t xml:space="preserve">Stats, streaks, hangouts, Wrapped</w:t>
+            </w:r>
+          </w:p>
+        </w:tc>
+      </w:tr>
+      <w:tr>
+        <w:trPr>
+          <w:cantSplit/>
+          <w:tblHeader w:val="false"/>
+        </w:trPr>
+        <w:tc>
+          <w:tcPr>
+            <w:tcW w:type="dxa" w:w="2939"/>
+            <w:tcBorders>
+              <w:top w:val="single" w:color="D5D8E3" w:sz="4"/>
+              <w:left w:val="single" w:color="D5D8E3" w:sz="4"/>
+              <w:bottom w:val="single" w:color="D5D8E3" w:sz="4"/>
+              <w:right w:val="single" w:color="D5D8E3" w:sz="4"/>
+            </w:tcBorders>
+            <w:shd w:fill="FFFFFF" w:color="auto" w:val="clear"/>
+            <w:tcMar>
+              <w:top w:type="dxa" w:w="60"/>
+              <w:left w:type="dxa" w:w="100"/>
+              <w:bottom w:type="dxa" w:w="60"/>
+              <w:right w:type="dxa" w:w="100"/>
+            </w:tcMar>
+          </w:tcPr>
+          <w:p>
+            <w:pPr>
+              <w:spacing w:after="20" w:line="264"/>
+            </w:pPr>
+            <w:r>
+              <w:rPr>
+                <w:sz w:val="19"/>
+                <w:szCs w:val="19"/>
+              </w:rPr>
+              <w:t xml:space="preserve">src/lib/help.js · install.js</w:t>
+            </w:r>
+          </w:p>
+        </w:tc>
+        <w:tc>
+          <w:tcPr>
+            <w:tcW w:type="dxa" w:w="6087"/>
+            <w:tcBorders>
+              <w:top w:val="single" w:color="D5D8E3" w:sz="4"/>
+              <w:left w:val="single" w:color="D5D8E3" w:sz="4"/>
+              <w:bottom w:val="single" w:color="D5D8E3" w:sz="4"/>
+              <w:right w:val="single" w:color="D5D8E3" w:sz="4"/>
+            </w:tcBorders>
+            <w:shd w:fill="FFFFFF" w:color="auto" w:val="clear"/>
+            <w:tcMar>
+              <w:top w:type="dxa" w:w="60"/>
+              <w:left w:type="dxa" w:w="100"/>
+              <w:bottom w:type="dxa" w:w="60"/>
+              <w:right w:type="dxa" w:w="100"/>
+            </w:tcMar>
+          </w:tcPr>
+          <w:p>
+            <w:pPr>
+              <w:spacing w:after="20" w:line="264"/>
+            </w:pPr>
+            <w:r>
+              <w:rPr>
+                <w:sz w:val="19"/>
+                <w:szCs w:val="19"/>
+              </w:rPr>
+              <w:t xml:space="preserve">Help topics and tour; Add to Home Screen detection</w:t>
+            </w:r>
+          </w:p>
+        </w:tc>
+      </w:tr>
+      <w:tr>
+        <w:trPr>
+          <w:cantSplit/>
+          <w:tblHeader w:val="false"/>
+        </w:trPr>
+        <w:tc>
+          <w:tcPr>
+            <w:tcW w:type="dxa" w:w="2939"/>
+            <w:tcBorders>
+              <w:top w:val="single" w:color="D5D8E3" w:sz="4"/>
+              <w:left w:val="single" w:color="D5D8E3" w:sz="4"/>
+              <w:bottom w:val="single" w:color="D5D8E3" w:sz="4"/>
+              <w:right w:val="single" w:color="D5D8E3" w:sz="4"/>
+            </w:tcBorders>
+            <w:shd w:fill="FAFBFD" w:color="auto" w:val="clear"/>
+            <w:tcMar>
+              <w:top w:type="dxa" w:w="60"/>
+              <w:left w:type="dxa" w:w="100"/>
+              <w:bottom w:type="dxa" w:w="60"/>
+              <w:right w:type="dxa" w:w="100"/>
+            </w:tcMar>
+          </w:tcPr>
+          <w:p>
+            <w:pPr>
+              <w:spacing w:after="20" w:line="264"/>
+            </w:pPr>
+            <w:r>
+              <w:rPr>
+                <w:sz w:val="19"/>
+                <w:szCs w:val="19"/>
+              </w:rPr>
+              <w:t xml:space="preserve">public/push-sw.js</w:t>
+            </w:r>
+          </w:p>
+        </w:tc>
+        <w:tc>
+          <w:tcPr>
+            <w:tcW w:type="dxa" w:w="6087"/>
+            <w:tcBorders>
+              <w:top w:val="single" w:color="D5D8E3" w:sz="4"/>
+              <w:left w:val="single" w:color="D5D8E3" w:sz="4"/>
+              <w:bottom w:val="single" w:color="D5D8E3" w:sz="4"/>
+              <w:right w:val="single" w:color="D5D8E3" w:sz="4"/>
+            </w:tcBorders>
+            <w:shd w:fill="FAFBFD" w:color="auto" w:val="clear"/>
+            <w:tcMar>
+              <w:top w:type="dxa" w:w="60"/>
+              <w:left w:type="dxa" w:w="100"/>
+              <w:bottom w:type="dxa" w:w="60"/>
+              <w:right w:type="dxa" w:w="100"/>
+            </w:tcMar>
+          </w:tcPr>
+          <w:p>
+            <w:pPr>
+              <w:spacing w:after="20" w:line="264"/>
+            </w:pPr>
+            <w:r>
+              <w:rPr>
+                <w:sz w:val="19"/>
+                <w:szCs w:val="19"/>
+              </w:rPr>
+              <w:t xml:space="preserve">Shows push notifications and opens the right screen when tapped</w:t>
+            </w:r>
+          </w:p>
+        </w:tc>
+      </w:tr>
+      <w:tr>
+        <w:trPr>
+          <w:cantSplit/>
+          <w:tblHeader w:val="false"/>
+        </w:trPr>
+        <w:tc>
+          <w:tcPr>
+            <w:tcW w:type="dxa" w:w="2939"/>
+            <w:tcBorders>
+              <w:top w:val="single" w:color="D5D8E3" w:sz="4"/>
+              <w:left w:val="single" w:color="D5D8E3" w:sz="4"/>
+              <w:bottom w:val="single" w:color="D5D8E3" w:sz="4"/>
+              <w:right w:val="single" w:color="D5D8E3" w:sz="4"/>
+            </w:tcBorders>
+            <w:shd w:fill="FFFFFF" w:color="auto" w:val="clear"/>
+            <w:tcMar>
+              <w:top w:type="dxa" w:w="60"/>
+              <w:left w:type="dxa" w:w="100"/>
+              <w:bottom w:type="dxa" w:w="60"/>
+              <w:right w:type="dxa" w:w="100"/>
+            </w:tcMar>
+          </w:tcPr>
+          <w:p>
+            <w:pPr>
+              <w:spacing w:after="20" w:line="264"/>
+            </w:pPr>
+            <w:r>
+              <w:rPr>
+                <w:sz w:val="19"/>
+                <w:szCs w:val="19"/>
+              </w:rPr>
+              <w:t xml:space="preserve">src/styles/app.css</w:t>
+            </w:r>
+          </w:p>
+        </w:tc>
+        <w:tc>
+          <w:tcPr>
+            <w:tcW w:type="dxa" w:w="6087"/>
+            <w:tcBorders>
+              <w:top w:val="single" w:color="D5D8E3" w:sz="4"/>
+              <w:left w:val="single" w:color="D5D8E3" w:sz="4"/>
+              <w:bottom w:val="single" w:color="D5D8E3" w:sz="4"/>
+              <w:right w:val="single" w:color="D5D8E3" w:sz="4"/>
+            </w:tcBorders>
+            <w:shd w:fill="FFFFFF" w:color="auto" w:val="clear"/>
+            <w:tcMar>
+              <w:top w:type="dxa" w:w="60"/>
+              <w:left w:type="dxa" w:w="100"/>
+              <w:bottom w:type="dxa" w:w="60"/>
+              <w:right w:type="dxa" w:w="100"/>
+            </w:tcMar>
+          </w:tcPr>
+          <w:p>
+            <w:pPr>
+              <w:spacing w:after="20" w:line="264"/>
+            </w:pPr>
+            <w:r>
+              <w:rPr>
+                <w:sz w:val="19"/>
+                <w:szCs w:val="19"/>
+              </w:rPr>
+              <w:t xml:space="preserve">All styling, light and dark colour tokens</w:t>
+            </w:r>
+          </w:p>
+        </w:tc>
+      </w:tr>
+      <w:tr>
+        <w:trPr>
+          <w:cantSplit/>
+          <w:tblHeader w:val="false"/>
+        </w:trPr>
+        <w:tc>
+          <w:tcPr>
+            <w:tcW w:type="dxa" w:w="2939"/>
+            <w:tcBorders>
+              <w:top w:val="single" w:color="D5D8E3" w:sz="4"/>
+              <w:left w:val="single" w:color="D5D8E3" w:sz="4"/>
+              <w:bottom w:val="single" w:color="D5D8E3" w:sz="4"/>
+              <w:right w:val="single" w:color="D5D8E3" w:sz="4"/>
+            </w:tcBorders>
+            <w:shd w:fill="FAFBFD" w:color="auto" w:val="clear"/>
+            <w:tcMar>
+              <w:top w:type="dxa" w:w="60"/>
+              <w:left w:type="dxa" w:w="100"/>
+              <w:bottom w:type="dxa" w:w="60"/>
+              <w:right w:type="dxa" w:w="100"/>
+            </w:tcMar>
+          </w:tcPr>
+          <w:p>
+            <w:pPr>
+              <w:spacing w:after="20" w:line="264"/>
+            </w:pPr>
+            <w:r>
+              <w:rPr>
+                <w:sz w:val="19"/>
+                <w:szCs w:val="19"/>
+              </w:rPr>
+              <w:t xml:space="preserve">supabase/functions/</w:t>
+            </w:r>
+          </w:p>
+        </w:tc>
+        <w:tc>
+          <w:tcPr>
+            <w:tcW w:type="dxa" w:w="6087"/>
+            <w:tcBorders>
+              <w:top w:val="single" w:color="D5D8E3" w:sz="4"/>
+              <w:left w:val="single" w:color="D5D8E3" w:sz="4"/>
+              <w:bottom w:val="single" w:color="D5D8E3" w:sz="4"/>
+              <w:right w:val="single" w:color="D5D8E3" w:sz="4"/>
+            </w:tcBorders>
+            <w:shd w:fill="FAFBFD" w:color="auto" w:val="clear"/>
+            <w:tcMar>
+              <w:top w:type="dxa" w:w="60"/>
+              <w:left w:type="dxa" w:w="100"/>
+              <w:bottom w:type="dxa" w:w="60"/>
+              <w:right w:type="dxa" w:w="100"/>
+            </w:tcMar>
+          </w:tcPr>
+          <w:p>
+            <w:pPr>
+              <w:spacing w:after="20" w:line="264"/>
+            </w:pPr>
+            <w:r>
+              <w:rPr>
+                <w:sz w:val="19"/>
+                <w:szCs w:val="19"/>
+              </w:rPr>
+              <w:t xml:space="preserve">import-ics, feed, smart-add, push, cleanup, and the shared .ics parser</w:t>
+            </w:r>
+          </w:p>
+        </w:tc>
+      </w:tr>
+      <w:tr>
+        <w:trPr>
+          <w:cantSplit/>
+          <w:tblHeader w:val="false"/>
+        </w:trPr>
+        <w:tc>
+          <w:tcPr>
+            <w:tcW w:type="dxa" w:w="2939"/>
+            <w:tcBorders>
+              <w:top w:val="single" w:color="D5D8E3" w:sz="4"/>
+              <w:left w:val="single" w:color="D5D8E3" w:sz="4"/>
+              <w:bottom w:val="single" w:color="D5D8E3" w:sz="4"/>
+              <w:right w:val="single" w:color="D5D8E3" w:sz="4"/>
+            </w:tcBorders>
+            <w:shd w:fill="FFFFFF" w:color="auto" w:val="clear"/>
+            <w:tcMar>
+              <w:top w:type="dxa" w:w="60"/>
+              <w:left w:type="dxa" w:w="100"/>
+              <w:bottom w:type="dxa" w:w="60"/>
+              <w:right w:type="dxa" w:w="100"/>
+            </w:tcMar>
+          </w:tcPr>
+          <w:p>
+            <w:pPr>
+              <w:spacing w:after="20" w:line="264"/>
+            </w:pPr>
+            <w:r>
+              <w:rPr>
+                <w:sz w:val="19"/>
+                <w:szCs w:val="19"/>
+              </w:rPr>
+              <w:t xml:space="preserve">supabase/schema.sql</w:t>
+            </w:r>
+          </w:p>
+        </w:tc>
+        <w:tc>
+          <w:tcPr>
+            <w:tcW w:type="dxa" w:w="6087"/>
+            <w:tcBorders>
+              <w:top w:val="single" w:color="D5D8E3" w:sz="4"/>
+              <w:left w:val="single" w:color="D5D8E3" w:sz="4"/>
+              <w:bottom w:val="single" w:color="D5D8E3" w:sz="4"/>
+              <w:right w:val="single" w:color="D5D8E3" w:sz="4"/>
+            </w:tcBorders>
+            <w:shd w:fill="FFFFFF" w:color="auto" w:val="clear"/>
+            <w:tcMar>
+              <w:top w:type="dxa" w:w="60"/>
+              <w:left w:type="dxa" w:w="100"/>
+              <w:bottom w:type="dxa" w:w="60"/>
+              <w:right w:type="dxa" w:w="100"/>
+            </w:tcMar>
+          </w:tcPr>
+          <w:p>
+            <w:pPr>
+              <w:spacing w:after="20" w:line="264"/>
+            </w:pPr>
+            <w:r>
+              <w:rPr>
+                <w:sz w:val="19"/>
+                <w:szCs w:val="19"/>
+              </w:rPr>
+              <w:t xml:space="preserve">The whole database structure and security rules</w:t>
+            </w:r>
+          </w:p>
+        </w:tc>
+      </w:tr>
+      <w:tr>
+        <w:trPr>
+          <w:cantSplit/>
+          <w:tblHeader w:val="false"/>
+        </w:trPr>
+        <w:tc>
+          <w:tcPr>
+            <w:tcW w:type="dxa" w:w="2939"/>
+            <w:tcBorders>
+              <w:top w:val="single" w:color="D5D8E3" w:sz="4"/>
+              <w:left w:val="single" w:color="D5D8E3" w:sz="4"/>
+              <w:bottom w:val="single" w:color="D5D8E3" w:sz="4"/>
+              <w:right w:val="single" w:color="D5D8E3" w:sz="4"/>
+            </w:tcBorders>
+            <w:shd w:fill="FAFBFD" w:color="auto" w:val="clear"/>
+            <w:tcMar>
+              <w:top w:type="dxa" w:w="60"/>
+              <w:left w:type="dxa" w:w="100"/>
+              <w:bottom w:type="dxa" w:w="60"/>
+              <w:right w:type="dxa" w:w="100"/>
+            </w:tcMar>
+          </w:tcPr>
+          <w:p>
+            <w:pPr>
+              <w:spacing w:after="20" w:line="264"/>
+            </w:pPr>
+            <w:r>
+              <w:rPr>
+                <w:sz w:val="19"/>
+                <w:szCs w:val="19"/>
+              </w:rPr>
               <w:t xml:space="preserve">vite.config.js</w:t>
             </w:r>
           </w:p>
@@ -4942,7 +8078,7 @@
         <w:pageBreakBefore/>
       </w:pPr>
       <w:r>
-        <w:t xml:space="preserve">12. Costs and limits</w:t>
+        <w:t xml:space="preserve">21. Costs and limits</w:t>
       </w:r>
     </w:p>
     <w:tbl>
@@ -5158,7 +8294,7 @@
                 <w:sz w:val="19"/>
                 <w:szCs w:val="19"/>
               </w:rPr>
-              <w:t xml:space="preserve">Free project pauses after a week of no use; 500 MB database; 1 GB storage</w:t>
+              <w:t xml:space="preserve">Free project pauses after a week of no use; 500 MB database; 1 GB storage shared by chat and memory photos (chat photos deleted after 6 months)</w:t>
             </w:r>
           </w:p>
         </w:tc>
@@ -5547,6 +8683,102 @@
           </w:p>
         </w:tc>
       </w:tr>
+      <w:tr>
+        <w:trPr>
+          <w:cantSplit/>
+          <w:tblHeader w:val="false"/>
+        </w:trPr>
+        <w:tc>
+          <w:tcPr>
+            <w:tcW w:type="dxa" w:w="2099"/>
+            <w:tcBorders>
+              <w:top w:val="single" w:color="D5D8E3" w:sz="4"/>
+              <w:left w:val="single" w:color="D5D8E3" w:sz="4"/>
+              <w:bottom w:val="single" w:color="D5D8E3" w:sz="4"/>
+              <w:right w:val="single" w:color="D5D8E3" w:sz="4"/>
+            </w:tcBorders>
+            <w:shd w:fill="FAFBFD" w:color="auto" w:val="clear"/>
+            <w:tcMar>
+              <w:top w:type="dxa" w:w="60"/>
+              <w:left w:type="dxa" w:w="100"/>
+              <w:bottom w:type="dxa" w:w="60"/>
+              <w:right w:type="dxa" w:w="100"/>
+            </w:tcMar>
+          </w:tcPr>
+          <w:p>
+            <w:pPr>
+              <w:spacing w:after="20" w:line="264"/>
+            </w:pPr>
+            <w:r>
+              <w:rPr>
+                <w:sz w:val="19"/>
+                <w:szCs w:val="19"/>
+              </w:rPr>
+              <w:t xml:space="preserve">Push notifications</w:t>
+            </w:r>
+          </w:p>
+        </w:tc>
+        <w:tc>
+          <w:tcPr>
+            <w:tcW w:type="dxa" w:w="2099"/>
+            <w:tcBorders>
+              <w:top w:val="single" w:color="D5D8E3" w:sz="4"/>
+              <w:left w:val="single" w:color="D5D8E3" w:sz="4"/>
+              <w:bottom w:val="single" w:color="D5D8E3" w:sz="4"/>
+              <w:right w:val="single" w:color="D5D8E3" w:sz="4"/>
+            </w:tcBorders>
+            <w:shd w:fill="FAFBFD" w:color="auto" w:val="clear"/>
+            <w:tcMar>
+              <w:top w:type="dxa" w:w="60"/>
+              <w:left w:type="dxa" w:w="100"/>
+              <w:bottom w:type="dxa" w:w="60"/>
+              <w:right w:type="dxa" w:w="100"/>
+            </w:tcMar>
+          </w:tcPr>
+          <w:p>
+            <w:pPr>
+              <w:spacing w:after="20" w:line="264"/>
+            </w:pPr>
+            <w:r>
+              <w:rPr>
+                <w:sz w:val="19"/>
+                <w:szCs w:val="19"/>
+              </w:rPr>
+              <w:t xml:space="preserve">£0</w:t>
+            </w:r>
+          </w:p>
+        </w:tc>
+        <w:tc>
+          <w:tcPr>
+            <w:tcW w:type="dxa" w:w="4828"/>
+            <w:tcBorders>
+              <w:top w:val="single" w:color="D5D8E3" w:sz="4"/>
+              <w:left w:val="single" w:color="D5D8E3" w:sz="4"/>
+              <w:bottom w:val="single" w:color="D5D8E3" w:sz="4"/>
+              <w:right w:val="single" w:color="D5D8E3" w:sz="4"/>
+            </w:tcBorders>
+            <w:shd w:fill="FAFBFD" w:color="auto" w:val="clear"/>
+            <w:tcMar>
+              <w:top w:type="dxa" w:w="60"/>
+              <w:left w:type="dxa" w:w="100"/>
+              <w:bottom w:type="dxa" w:w="60"/>
+              <w:right w:type="dxa" w:w="100"/>
+            </w:tcMar>
+          </w:tcPr>
+          <w:p>
+            <w:pPr>
+              <w:spacing w:after="20" w:line="264"/>
+            </w:pPr>
+            <w:r>
+              <w:rPr>
+                <w:sz w:val="19"/>
+                <w:szCs w:val="19"/>
+              </w:rPr>
+              <w:t xml:space="preserve">Web Push is free; iPhone needs the Home Screen app (iOS 16.4+)</w:t>
+            </w:r>
+          </w:p>
+        </w:tc>
+      </w:tr>
     </w:tbl>
     <w:p>
       <w:pPr>
@@ -5569,7 +8801,7 @@
         <w:pageBreakBefore/>
       </w:pPr>
       <w:r>
-        <w:t xml:space="preserve">13. Presenting Klander</w:t>
+        <w:t xml:space="preserve">22. Presenting Klander</w:t>
       </w:r>
     </w:p>
     <w:p>
@@ -5577,7 +8809,7 @@
         <w:pStyle w:val="Heading2"/>
       </w:pPr>
       <w:r>
-        <w:t xml:space="preserve">3-minute talk</w:t>
+        <w:t xml:space="preserve">3-minute talk (about 3½ with the new features)</w:t>
       </w:r>
     </w:p>
     <w:tbl>
@@ -6147,7 +9379,7 @@
                 <w:sz w:val="19"/>
                 <w:szCs w:val="19"/>
               </w:rPr>
-              <w:t xml:space="preserve">"It works with what people already use: it imports my uni timetable link and my mum sees my plans in Apple Calendar."</w:t>
+              <w:t xml:space="preserve">"Then it helps us actually meet: Find a time uses only when people are busy, never what they're doing. I invite people, they say Going, and the plan has its own chat."</w:t>
             </w:r>
           </w:p>
         </w:tc>
@@ -6177,7 +9409,7 @@
                 <w:sz w:val="19"/>
                 <w:szCs w:val="19"/>
               </w:rPr>
-              <w:t xml:space="preserve">Calendars screen</w:t>
+              <w:t xml:space="preserve">Plans → Find a time → invite</w:t>
             </w:r>
           </w:p>
         </w:tc>
@@ -6243,7 +9475,7 @@
                 <w:sz w:val="19"/>
                 <w:szCs w:val="19"/>
               </w:rPr>
-              <w:t xml:space="preserve">"It's a PWA on React and Supabase, costs £0 a month, and has 67 recorded tests. Next: birthdays, a free-time finder, chat and a weekly photo story."</w:t>
+              <w:t xml:space="preserve">"It works with what people already use and fits my life: my uni timetable syncs in, my mum follows a family link in Apple Calendar, and after a night shift it knows I'm asleep."</w:t>
             </w:r>
           </w:p>
         </w:tc>
@@ -6273,7 +9505,103 @@
                 <w:sz w:val="19"/>
                 <w:szCs w:val="19"/>
               </w:rPr>
-              <w:t xml:space="preserve">Roadmap page</w:t>
+              <w:t xml:space="preserve">Sleep blocks, family link</w:t>
+            </w:r>
+          </w:p>
+        </w:tc>
+      </w:tr>
+      <w:tr>
+        <w:trPr>
+          <w:cantSplit/>
+          <w:tblHeader w:val="false"/>
+        </w:trPr>
+        <w:tc>
+          <w:tcPr>
+            <w:tcW w:type="dxa" w:w="934"/>
+            <w:tcBorders>
+              <w:top w:val="single" w:color="D5D8E3" w:sz="4"/>
+              <w:left w:val="single" w:color="D5D8E3" w:sz="4"/>
+              <w:bottom w:val="single" w:color="D5D8E3" w:sz="4"/>
+              <w:right w:val="single" w:color="D5D8E3" w:sz="4"/>
+            </w:tcBorders>
+            <w:shd w:fill="FFFFFF" w:color="auto" w:val="clear"/>
+            <w:tcMar>
+              <w:top w:type="dxa" w:w="60"/>
+              <w:left w:type="dxa" w:w="100"/>
+              <w:bottom w:type="dxa" w:w="60"/>
+              <w:right w:type="dxa" w:w="100"/>
+            </w:tcMar>
+          </w:tcPr>
+          <w:p>
+            <w:pPr>
+              <w:spacing w:after="20" w:line="264"/>
+            </w:pPr>
+            <w:r>
+              <w:rPr>
+                <w:sz w:val="19"/>
+                <w:szCs w:val="19"/>
+              </w:rPr>
+              <w:t xml:space="preserve">2:55</w:t>
+            </w:r>
+          </w:p>
+        </w:tc>
+        <w:tc>
+          <w:tcPr>
+            <w:tcW w:type="dxa" w:w="5395"/>
+            <w:tcBorders>
+              <w:top w:val="single" w:color="D5D8E3" w:sz="4"/>
+              <w:left w:val="single" w:color="D5D8E3" w:sz="4"/>
+              <w:bottom w:val="single" w:color="D5D8E3" w:sz="4"/>
+              <w:right w:val="single" w:color="D5D8E3" w:sz="4"/>
+            </w:tcBorders>
+            <w:shd w:fill="FFFFFF" w:color="auto" w:val="clear"/>
+            <w:tcMar>
+              <w:top w:type="dxa" w:w="60"/>
+              <w:left w:type="dxa" w:w="100"/>
+              <w:bottom w:type="dxa" w:w="60"/>
+              <w:right w:type="dxa" w:w="100"/>
+            </w:tcMar>
+          </w:tcPr>
+          <w:p>
+            <w:pPr>
+              <w:spacing w:after="20" w:line="264"/>
+            </w:pPr>
+            <w:r>
+              <w:rPr>
+                <w:sz w:val="19"/>
+                <w:szCs w:val="19"/>
+              </w:rPr>
+              <w:t xml:space="preserve">"It's a PWA on React and Supabase, costs £0 a month, sends lock-screen notifications, and every privacy rule has a test. Next: a privacy page, data export and a public launch."</w:t>
+            </w:r>
+          </w:p>
+        </w:tc>
+        <w:tc>
+          <w:tcPr>
+            <w:tcW w:type="dxa" w:w="2697"/>
+            <w:tcBorders>
+              <w:top w:val="single" w:color="D5D8E3" w:sz="4"/>
+              <w:left w:val="single" w:color="D5D8E3" w:sz="4"/>
+              <w:bottom w:val="single" w:color="D5D8E3" w:sz="4"/>
+              <w:right w:val="single" w:color="D5D8E3" w:sz="4"/>
+            </w:tcBorders>
+            <w:shd w:fill="FFFFFF" w:color="auto" w:val="clear"/>
+            <w:tcMar>
+              <w:top w:type="dxa" w:w="60"/>
+              <w:left w:type="dxa" w:w="100"/>
+              <w:bottom w:type="dxa" w:w="60"/>
+              <w:right w:type="dxa" w:w="100"/>
+            </w:tcMar>
+          </w:tcPr>
+          <w:p>
+            <w:pPr>
+              <w:spacing w:after="20" w:line="264"/>
+            </w:pPr>
+            <w:r>
+              <w:rPr>
+                <w:sz w:val="19"/>
+                <w:szCs w:val="19"/>
+              </w:rPr>
+              <w:t xml:space="preserve">Insights / Wrapped, then roadmap</w:t>
             </w:r>
           </w:p>
         </w:tc>
@@ -6341,11 +9669,37 @@
     </w:p>
     <w:p>
       <w:pPr>
+        <w:pStyle w:val="ListParagraph"/>
+        <w:numPr>
+          <w:ilvl w:val="0"/>
+          <w:numId w:val="4"/>
+        </w:numPr>
+        <w:spacing w:after="60" w:line="288"/>
+      </w:pPr>
+      <w:r>
+        <w:t xml:space="preserve">Make sure notifications are on and send yourself a test from the bell, so you can show one arriving.</w:t>
+      </w:r>
+    </w:p>
+    <w:p>
+      <w:pPr>
+        <w:pStyle w:val="ListParagraph"/>
+        <w:numPr>
+          <w:ilvl w:val="0"/>
+          <w:numId w:val="4"/>
+        </w:numPr>
+        <w:spacing w:after="60" w:line="288"/>
+      </w:pPr>
+      <w:r>
+        <w:t xml:space="preserve">Have a plan with a guest list and a chat, a posted My Week, and enough events for Insights to look full.</w:t>
+      </w:r>
+    </w:p>
+    <w:p>
+      <w:pPr>
         <w:pStyle w:val="Heading1"/>
         <w:pageBreakBefore/>
       </w:pPr>
       <w:r>
-        <w:t xml:space="preserve">14. Questions you might be asked</w:t>
+        <w:t xml:space="preserve">23. Questions you might be asked</w:t>
       </w:r>
     </w:p>
     <w:tbl>
@@ -7091,7 +10445,7 @@
                 <w:sz w:val="19"/>
                 <w:szCs w:val="19"/>
               </w:rPr>
-              <w:t xml:space="preserve">Database security tests as fake users, unit tests for repeats, layout and the calendar parser, live tests of the deployed functions, automated phone-size UI tests with screenshots, and real use with two accounts. 67 recorded tests, all passing.</w:t>
+              <w:t xml:space="preserve">Database security tests as fake users for every privacy rule (34 more for phases 6–11, run against the live database), 269 automated logic checks, live tests of the deployed functions, phone-size UI tests with screenshots, and real use on my own phone. All passing.</w:t>
             </w:r>
           </w:p>
         </w:tc>
@@ -7289,7 +10643,7 @@
                 <w:sz w:val="19"/>
                 <w:szCs w:val="19"/>
               </w:rPr>
-              <w:t xml:space="preserve">Themes and automatic birthdays, then a free-time finder, chat, a weekly photo "My Week" story, and lock-screen notifications.</w:t>
+              <w:t xml:space="preserve">Phase 12: a privacy page, download my data and delete my account, a landing page and demo mode, then opening it to more people.</w:t>
             </w:r>
           </w:p>
         </w:tc>
@@ -7325,6 +10679,336 @@
                 <w:sz w:val="19"/>
                 <w:szCs w:val="19"/>
               </w:rPr>
+              <w:t xml:space="preserve">How do notifications work without an app store app?</w:t>
+            </w:r>
+          </w:p>
+        </w:tc>
+        <w:tc>
+          <w:tcPr>
+            <w:tcW w:type="dxa" w:w="6297"/>
+            <w:tcBorders>
+              <w:top w:val="single" w:color="D5D8E3" w:sz="4"/>
+              <w:left w:val="single" w:color="D5D8E3" w:sz="4"/>
+              <w:bottom w:val="single" w:color="D5D8E3" w:sz="4"/>
+              <w:right w:val="single" w:color="D5D8E3" w:sz="4"/>
+            </w:tcBorders>
+            <w:shd w:fill="FAFBFD" w:color="auto" w:val="clear"/>
+            <w:tcMar>
+              <w:top w:type="dxa" w:w="60"/>
+              <w:left w:type="dxa" w:w="100"/>
+              <w:bottom w:type="dxa" w:w="60"/>
+              <w:right w:type="dxa" w:w="100"/>
+            </w:tcMar>
+          </w:tcPr>
+          <w:p>
+            <w:pPr>
+              <w:spacing w:after="20" w:line="264"/>
+            </w:pPr>
+            <w:r>
+              <w:rPr>
+                <w:sz w:val="19"/>
+                <w:szCs w:val="19"/>
+              </w:rPr>
+              <w:t xml:space="preserve">Web Push. The phone gives Klander a push address; a database trigger queues the notification; a function on a 1-minute timer sends it with Klander's VAPID key; Apple or Google delivers it. On iPhone it needs the Home Screen app.</w:t>
+            </w:r>
+          </w:p>
+        </w:tc>
+      </w:tr>
+      <w:tr>
+        <w:trPr>
+          <w:cantSplit/>
+          <w:tblHeader w:val="false"/>
+        </w:trPr>
+        <w:tc>
+          <w:tcPr>
+            <w:tcW w:type="dxa" w:w="2729"/>
+            <w:tcBorders>
+              <w:top w:val="single" w:color="D5D8E3" w:sz="4"/>
+              <w:left w:val="single" w:color="D5D8E3" w:sz="4"/>
+              <w:bottom w:val="single" w:color="D5D8E3" w:sz="4"/>
+              <w:right w:val="single" w:color="D5D8E3" w:sz="4"/>
+            </w:tcBorders>
+            <w:shd w:fill="FFFFFF" w:color="auto" w:val="clear"/>
+            <w:tcMar>
+              <w:top w:type="dxa" w:w="60"/>
+              <w:left w:type="dxa" w:w="100"/>
+              <w:bottom w:type="dxa" w:w="60"/>
+              <w:right w:type="dxa" w:w="100"/>
+            </w:tcMar>
+          </w:tcPr>
+          <w:p>
+            <w:pPr>
+              <w:spacing w:after="20" w:line="264"/>
+            </w:pPr>
+            <w:r>
+              <w:rPr>
+                <w:sz w:val="19"/>
+                <w:szCs w:val="19"/>
+              </w:rPr>
+              <w:t xml:space="preserve">How does Find a time protect privacy?</w:t>
+            </w:r>
+          </w:p>
+        </w:tc>
+        <w:tc>
+          <w:tcPr>
+            <w:tcW w:type="dxa" w:w="6297"/>
+            <w:tcBorders>
+              <w:top w:val="single" w:color="D5D8E3" w:sz="4"/>
+              <w:left w:val="single" w:color="D5D8E3" w:sz="4"/>
+              <w:bottom w:val="single" w:color="D5D8E3" w:sz="4"/>
+              <w:right w:val="single" w:color="D5D8E3" w:sz="4"/>
+            </w:tcBorders>
+            <w:shd w:fill="FFFFFF" w:color="auto" w:val="clear"/>
+            <w:tcMar>
+              <w:top w:type="dxa" w:w="60"/>
+              <w:left w:type="dxa" w:w="100"/>
+              <w:bottom w:type="dxa" w:w="60"/>
+              <w:right w:type="dxa" w:w="100"/>
+            </w:tcMar>
+          </w:tcPr>
+          <w:p>
+            <w:pPr>
+              <w:spacing w:after="20" w:line="264"/>
+            </w:pPr>
+            <w:r>
+              <w:rPr>
+                <w:sz w:val="19"/>
+                <w:szCs w:val="19"/>
+              </w:rPr>
+              <w:t xml:space="preserve">It only gets busy start and end times from the database, never titles or places, so it can compare everyone without anyone sharing details.</w:t>
+            </w:r>
+          </w:p>
+        </w:tc>
+      </w:tr>
+      <w:tr>
+        <w:trPr>
+          <w:cantSplit/>
+          <w:tblHeader w:val="false"/>
+        </w:trPr>
+        <w:tc>
+          <w:tcPr>
+            <w:tcW w:type="dxa" w:w="2729"/>
+            <w:tcBorders>
+              <w:top w:val="single" w:color="D5D8E3" w:sz="4"/>
+              <w:left w:val="single" w:color="D5D8E3" w:sz="4"/>
+              <w:bottom w:val="single" w:color="D5D8E3" w:sz="4"/>
+              <w:right w:val="single" w:color="D5D8E3" w:sz="4"/>
+            </w:tcBorders>
+            <w:shd w:fill="FAFBFD" w:color="auto" w:val="clear"/>
+            <w:tcMar>
+              <w:top w:type="dxa" w:w="60"/>
+              <w:left w:type="dxa" w:w="100"/>
+              <w:bottom w:type="dxa" w:w="60"/>
+              <w:right w:type="dxa" w:w="100"/>
+            </w:tcMar>
+          </w:tcPr>
+          <w:p>
+            <w:pPr>
+              <w:spacing w:after="20" w:line="264"/>
+            </w:pPr>
+            <w:r>
+              <w:rPr>
+                <w:sz w:val="19"/>
+                <w:szCs w:val="19"/>
+              </w:rPr>
+              <w:t xml:space="preserve">What was the hardest bug after phase 5?</w:t>
+            </w:r>
+          </w:p>
+        </w:tc>
+        <w:tc>
+          <w:tcPr>
+            <w:tcW w:type="dxa" w:w="6297"/>
+            <w:tcBorders>
+              <w:top w:val="single" w:color="D5D8E3" w:sz="4"/>
+              <w:left w:val="single" w:color="D5D8E3" w:sz="4"/>
+              <w:bottom w:val="single" w:color="D5D8E3" w:sz="4"/>
+              <w:right w:val="single" w:color="D5D8E3" w:sz="4"/>
+            </w:tcBorders>
+            <w:shd w:fill="FAFBFD" w:color="auto" w:val="clear"/>
+            <w:tcMar>
+              <w:top w:type="dxa" w:w="60"/>
+              <w:left w:type="dxa" w:w="100"/>
+              <w:bottom w:type="dxa" w:w="60"/>
+              <w:right w:type="dxa" w:w="100"/>
+            </w:tcMar>
+          </w:tcPr>
+          <w:p>
+            <w:pPr>
+              <w:spacing w:after="20" w:line="264"/>
+            </w:pPr>
+            <w:r>
+              <w:rPr>
+                <w:sz w:val="19"/>
+                <w:szCs w:val="19"/>
+              </w:rPr>
+              <w:t xml:space="preserve">Reminders that silently never got created on the real server. The "only once" rule used a partial index Postgres can't use for upserts. I found it by testing on my own phone and fixed it with a unique key.</w:t>
+            </w:r>
+          </w:p>
+        </w:tc>
+      </w:tr>
+      <w:tr>
+        <w:trPr>
+          <w:cantSplit/>
+          <w:tblHeader w:val="false"/>
+        </w:trPr>
+        <w:tc>
+          <w:tcPr>
+            <w:tcW w:type="dxa" w:w="2729"/>
+            <w:tcBorders>
+              <w:top w:val="single" w:color="D5D8E3" w:sz="4"/>
+              <w:left w:val="single" w:color="D5D8E3" w:sz="4"/>
+              <w:bottom w:val="single" w:color="D5D8E3" w:sz="4"/>
+              <w:right w:val="single" w:color="D5D8E3" w:sz="4"/>
+            </w:tcBorders>
+            <w:shd w:fill="FFFFFF" w:color="auto" w:val="clear"/>
+            <w:tcMar>
+              <w:top w:type="dxa" w:w="60"/>
+              <w:left w:type="dxa" w:w="100"/>
+              <w:bottom w:type="dxa" w:w="60"/>
+              <w:right w:type="dxa" w:w="100"/>
+            </w:tcMar>
+          </w:tcPr>
+          <w:p>
+            <w:pPr>
+              <w:spacing w:after="20" w:line="264"/>
+            </w:pPr>
+            <w:r>
+              <w:rPr>
+                <w:sz w:val="19"/>
+                <w:szCs w:val="19"/>
+              </w:rPr>
+              <w:t xml:space="preserve">Why didn't you build two-way Apple sync?</w:t>
+            </w:r>
+          </w:p>
+        </w:tc>
+        <w:tc>
+          <w:tcPr>
+            <w:tcW w:type="dxa" w:w="6297"/>
+            <w:tcBorders>
+              <w:top w:val="single" w:color="D5D8E3" w:sz="4"/>
+              <w:left w:val="single" w:color="D5D8E3" w:sz="4"/>
+              <w:bottom w:val="single" w:color="D5D8E3" w:sz="4"/>
+              <w:right w:val="single" w:color="D5D8E3" w:sz="4"/>
+            </w:tcBorders>
+            <w:shd w:fill="FFFFFF" w:color="auto" w:val="clear"/>
+            <w:tcMar>
+              <w:top w:type="dxa" w:w="60"/>
+              <w:left w:type="dxa" w:w="100"/>
+              <w:bottom w:type="dxa" w:w="60"/>
+              <w:right w:type="dxa" w:w="100"/>
+            </w:tcMar>
+          </w:tcPr>
+          <w:p>
+            <w:pPr>
+              <w:spacing w:after="20" w:line="264"/>
+            </w:pPr>
+            <w:r>
+              <w:rPr>
+                <w:sz w:val="19"/>
+                <w:szCs w:val="19"/>
+              </w:rPr>
+              <w:t xml:space="preserve">It needs an Apple app-specific password that can read every iCloud calendar. I decided the risk wasn't worth it and built a read-only family link instead.</w:t>
+            </w:r>
+          </w:p>
+        </w:tc>
+      </w:tr>
+      <w:tr>
+        <w:trPr>
+          <w:cantSplit/>
+          <w:tblHeader w:val="false"/>
+        </w:trPr>
+        <w:tc>
+          <w:tcPr>
+            <w:tcW w:type="dxa" w:w="2729"/>
+            <w:tcBorders>
+              <w:top w:val="single" w:color="D5D8E3" w:sz="4"/>
+              <w:left w:val="single" w:color="D5D8E3" w:sz="4"/>
+              <w:bottom w:val="single" w:color="D5D8E3" w:sz="4"/>
+              <w:right w:val="single" w:color="D5D8E3" w:sz="4"/>
+            </w:tcBorders>
+            <w:shd w:fill="FAFBFD" w:color="auto" w:val="clear"/>
+            <w:tcMar>
+              <w:top w:type="dxa" w:w="60"/>
+              <w:left w:type="dxa" w:w="100"/>
+              <w:bottom w:type="dxa" w:w="60"/>
+              <w:right w:type="dxa" w:w="100"/>
+            </w:tcMar>
+          </w:tcPr>
+          <w:p>
+            <w:pPr>
+              <w:spacing w:after="20" w:line="264"/>
+            </w:pPr>
+            <w:r>
+              <w:rPr>
+                <w:sz w:val="19"/>
+                <w:szCs w:val="19"/>
+              </w:rPr>
+              <w:t xml:space="preserve">Who can see my chats and photos?</w:t>
+            </w:r>
+          </w:p>
+        </w:tc>
+        <w:tc>
+          <w:tcPr>
+            <w:tcW w:type="dxa" w:w="6297"/>
+            <w:tcBorders>
+              <w:top w:val="single" w:color="D5D8E3" w:sz="4"/>
+              <w:left w:val="single" w:color="D5D8E3" w:sz="4"/>
+              <w:bottom w:val="single" w:color="D5D8E3" w:sz="4"/>
+              <w:right w:val="single" w:color="D5D8E3" w:sz="4"/>
+            </w:tcBorders>
+            <w:shd w:fill="FAFBFD" w:color="auto" w:val="clear"/>
+            <w:tcMar>
+              <w:top w:type="dxa" w:w="60"/>
+              <w:left w:type="dxa" w:w="100"/>
+              <w:bottom w:type="dxa" w:w="60"/>
+              <w:right w:type="dxa" w:w="100"/>
+            </w:tcMar>
+          </w:tcPr>
+          <w:p>
+            <w:pPr>
+              <w:spacing w:after="20" w:line="264"/>
+            </w:pPr>
+            <w:r>
+              <w:rPr>
+                <w:sz w:val="19"/>
+                <w:szCs w:val="19"/>
+              </w:rPr>
+              <w:t xml:space="preserve">Only chat members, enforced in the database and in private storage buckets. Photos you hide from My Week are saved without their file path, so they can't be loaded.</w:t>
+            </w:r>
+          </w:p>
+        </w:tc>
+      </w:tr>
+      <w:tr>
+        <w:trPr>
+          <w:cantSplit/>
+          <w:tblHeader w:val="false"/>
+        </w:trPr>
+        <w:tc>
+          <w:tcPr>
+            <w:tcW w:type="dxa" w:w="2729"/>
+            <w:tcBorders>
+              <w:top w:val="single" w:color="D5D8E3" w:sz="4"/>
+              <w:left w:val="single" w:color="D5D8E3" w:sz="4"/>
+              <w:bottom w:val="single" w:color="D5D8E3" w:sz="4"/>
+              <w:right w:val="single" w:color="D5D8E3" w:sz="4"/>
+            </w:tcBorders>
+            <w:shd w:fill="FFFFFF" w:color="auto" w:val="clear"/>
+            <w:tcMar>
+              <w:top w:type="dxa" w:w="60"/>
+              <w:left w:type="dxa" w:w="100"/>
+              <w:bottom w:type="dxa" w:w="60"/>
+              <w:right w:type="dxa" w:w="100"/>
+            </w:tcMar>
+          </w:tcPr>
+          <w:p>
+            <w:pPr>
+              <w:spacing w:after="20" w:line="264"/>
+            </w:pPr>
+            <w:r>
+              <w:rPr>
+                <w:sz w:val="19"/>
+                <w:szCs w:val="19"/>
+              </w:rPr>
               <w:t xml:space="preserve">Is it GDPR-safe?</w:t>
             </w:r>
           </w:p>
@@ -7338,7 +11022,7 @@
               <w:bottom w:val="single" w:color="D5D8E3" w:sz="4"/>
               <w:right w:val="single" w:color="D5D8E3" w:sz="4"/>
             </w:tcBorders>
-            <w:shd w:fill="FAFBFD" w:color="auto" w:val="clear"/>
+            <w:shd w:fill="FFFFFF" w:color="auto" w:val="clear"/>
             <w:tcMar>
               <w:top w:type="dxa" w:w="60"/>
               <w:left w:type="dxa" w:w="100"/>
@@ -7367,7 +11051,7 @@
         <w:pageBreakBefore/>
       </w:pPr>
       <w:r>
-        <w:t xml:space="preserve">15. Mini glossary</w:t>
+        <w:t xml:space="preserve">24. Mini glossary</w:t>
       </w:r>
     </w:p>
     <w:tbl>
@@ -8180,6 +11864,336 @@
                 <w:szCs w:val="19"/>
               </w:rPr>
               <w:t xml:space="preserve">A saved, named change to the database structure</w:t>
+            </w:r>
+          </w:p>
+        </w:tc>
+      </w:tr>
+      <w:tr>
+        <w:trPr>
+          <w:cantSplit/>
+          <w:tblHeader w:val="false"/>
+        </w:trPr>
+        <w:tc>
+          <w:tcPr>
+            <w:tcW w:type="dxa" w:w="2519"/>
+            <w:tcBorders>
+              <w:top w:val="single" w:color="D5D8E3" w:sz="4"/>
+              <w:left w:val="single" w:color="D5D8E3" w:sz="4"/>
+              <w:bottom w:val="single" w:color="D5D8E3" w:sz="4"/>
+              <w:right w:val="single" w:color="D5D8E3" w:sz="4"/>
+            </w:tcBorders>
+            <w:shd w:fill="FAFBFD" w:color="auto" w:val="clear"/>
+            <w:tcMar>
+              <w:top w:type="dxa" w:w="60"/>
+              <w:left w:type="dxa" w:w="100"/>
+              <w:bottom w:type="dxa" w:w="60"/>
+              <w:right w:type="dxa" w:w="100"/>
+            </w:tcMar>
+          </w:tcPr>
+          <w:p>
+            <w:pPr>
+              <w:spacing w:after="20" w:line="264"/>
+            </w:pPr>
+            <w:r>
+              <w:rPr>
+                <w:sz w:val="19"/>
+                <w:szCs w:val="19"/>
+              </w:rPr>
+              <w:t xml:space="preserve">Web Push</w:t>
+            </w:r>
+          </w:p>
+        </w:tc>
+        <w:tc>
+          <w:tcPr>
+            <w:tcW w:type="dxa" w:w="6507"/>
+            <w:tcBorders>
+              <w:top w:val="single" w:color="D5D8E3" w:sz="4"/>
+              <w:left w:val="single" w:color="D5D8E3" w:sz="4"/>
+              <w:bottom w:val="single" w:color="D5D8E3" w:sz="4"/>
+              <w:right w:val="single" w:color="D5D8E3" w:sz="4"/>
+            </w:tcBorders>
+            <w:shd w:fill="FAFBFD" w:color="auto" w:val="clear"/>
+            <w:tcMar>
+              <w:top w:type="dxa" w:w="60"/>
+              <w:left w:type="dxa" w:w="100"/>
+              <w:bottom w:type="dxa" w:w="60"/>
+              <w:right w:type="dxa" w:w="100"/>
+            </w:tcMar>
+          </w:tcPr>
+          <w:p>
+            <w:pPr>
+              <w:spacing w:after="20" w:line="264"/>
+            </w:pPr>
+            <w:r>
+              <w:rPr>
+                <w:sz w:val="19"/>
+                <w:szCs w:val="19"/>
+              </w:rPr>
+              <w:t xml:space="preserve">How a website sends lock-screen notifications</w:t>
+            </w:r>
+          </w:p>
+        </w:tc>
+      </w:tr>
+      <w:tr>
+        <w:trPr>
+          <w:cantSplit/>
+          <w:tblHeader w:val="false"/>
+        </w:trPr>
+        <w:tc>
+          <w:tcPr>
+            <w:tcW w:type="dxa" w:w="2519"/>
+            <w:tcBorders>
+              <w:top w:val="single" w:color="D5D8E3" w:sz="4"/>
+              <w:left w:val="single" w:color="D5D8E3" w:sz="4"/>
+              <w:bottom w:val="single" w:color="D5D8E3" w:sz="4"/>
+              <w:right w:val="single" w:color="D5D8E3" w:sz="4"/>
+            </w:tcBorders>
+            <w:shd w:fill="FFFFFF" w:color="auto" w:val="clear"/>
+            <w:tcMar>
+              <w:top w:type="dxa" w:w="60"/>
+              <w:left w:type="dxa" w:w="100"/>
+              <w:bottom w:type="dxa" w:w="60"/>
+              <w:right w:type="dxa" w:w="100"/>
+            </w:tcMar>
+          </w:tcPr>
+          <w:p>
+            <w:pPr>
+              <w:spacing w:after="20" w:line="264"/>
+            </w:pPr>
+            <w:r>
+              <w:rPr>
+                <w:sz w:val="19"/>
+                <w:szCs w:val="19"/>
+              </w:rPr>
+              <w:t xml:space="preserve">Service worker</w:t>
+            </w:r>
+          </w:p>
+        </w:tc>
+        <w:tc>
+          <w:tcPr>
+            <w:tcW w:type="dxa" w:w="6507"/>
+            <w:tcBorders>
+              <w:top w:val="single" w:color="D5D8E3" w:sz="4"/>
+              <w:left w:val="single" w:color="D5D8E3" w:sz="4"/>
+              <w:bottom w:val="single" w:color="D5D8E3" w:sz="4"/>
+              <w:right w:val="single" w:color="D5D8E3" w:sz="4"/>
+            </w:tcBorders>
+            <w:shd w:fill="FFFFFF" w:color="auto" w:val="clear"/>
+            <w:tcMar>
+              <w:top w:type="dxa" w:w="60"/>
+              <w:left w:type="dxa" w:w="100"/>
+              <w:bottom w:type="dxa" w:w="60"/>
+              <w:right w:type="dxa" w:w="100"/>
+            </w:tcMar>
+          </w:tcPr>
+          <w:p>
+            <w:pPr>
+              <w:spacing w:after="20" w:line="264"/>
+            </w:pPr>
+            <w:r>
+              <w:rPr>
+                <w:sz w:val="19"/>
+                <w:szCs w:val="19"/>
+              </w:rPr>
+              <w:t xml:space="preserve">A script the phone keeps for the app: offline and notifications</w:t>
+            </w:r>
+          </w:p>
+        </w:tc>
+      </w:tr>
+      <w:tr>
+        <w:trPr>
+          <w:cantSplit/>
+          <w:tblHeader w:val="false"/>
+        </w:trPr>
+        <w:tc>
+          <w:tcPr>
+            <w:tcW w:type="dxa" w:w="2519"/>
+            <w:tcBorders>
+              <w:top w:val="single" w:color="D5D8E3" w:sz="4"/>
+              <w:left w:val="single" w:color="D5D8E3" w:sz="4"/>
+              <w:bottom w:val="single" w:color="D5D8E3" w:sz="4"/>
+              <w:right w:val="single" w:color="D5D8E3" w:sz="4"/>
+            </w:tcBorders>
+            <w:shd w:fill="FAFBFD" w:color="auto" w:val="clear"/>
+            <w:tcMar>
+              <w:top w:type="dxa" w:w="60"/>
+              <w:left w:type="dxa" w:w="100"/>
+              <w:bottom w:type="dxa" w:w="60"/>
+              <w:right w:type="dxa" w:w="100"/>
+            </w:tcMar>
+          </w:tcPr>
+          <w:p>
+            <w:pPr>
+              <w:spacing w:after="20" w:line="264"/>
+            </w:pPr>
+            <w:r>
+              <w:rPr>
+                <w:sz w:val="19"/>
+                <w:szCs w:val="19"/>
+              </w:rPr>
+              <w:t xml:space="preserve">Contrast ratio</w:t>
+            </w:r>
+          </w:p>
+        </w:tc>
+        <w:tc>
+          <w:tcPr>
+            <w:tcW w:type="dxa" w:w="6507"/>
+            <w:tcBorders>
+              <w:top w:val="single" w:color="D5D8E3" w:sz="4"/>
+              <w:left w:val="single" w:color="D5D8E3" w:sz="4"/>
+              <w:bottom w:val="single" w:color="D5D8E3" w:sz="4"/>
+              <w:right w:val="single" w:color="D5D8E3" w:sz="4"/>
+            </w:tcBorders>
+            <w:shd w:fill="FAFBFD" w:color="auto" w:val="clear"/>
+            <w:tcMar>
+              <w:top w:type="dxa" w:w="60"/>
+              <w:left w:type="dxa" w:w="100"/>
+              <w:bottom w:type="dxa" w:w="60"/>
+              <w:right w:type="dxa" w:w="100"/>
+            </w:tcMar>
+          </w:tcPr>
+          <w:p>
+            <w:pPr>
+              <w:spacing w:after="20" w:line="264"/>
+            </w:pPr>
+            <w:r>
+              <w:rPr>
+                <w:sz w:val="19"/>
+                <w:szCs w:val="19"/>
+              </w:rPr>
+              <w:t xml:space="preserve">How readable text is against its background (4.5 or more is good)</w:t>
+            </w:r>
+          </w:p>
+        </w:tc>
+      </w:tr>
+      <w:tr>
+        <w:trPr>
+          <w:cantSplit/>
+          <w:tblHeader w:val="false"/>
+        </w:trPr>
+        <w:tc>
+          <w:tcPr>
+            <w:tcW w:type="dxa" w:w="2519"/>
+            <w:tcBorders>
+              <w:top w:val="single" w:color="D5D8E3" w:sz="4"/>
+              <w:left w:val="single" w:color="D5D8E3" w:sz="4"/>
+              <w:bottom w:val="single" w:color="D5D8E3" w:sz="4"/>
+              <w:right w:val="single" w:color="D5D8E3" w:sz="4"/>
+            </w:tcBorders>
+            <w:shd w:fill="FFFFFF" w:color="auto" w:val="clear"/>
+            <w:tcMar>
+              <w:top w:type="dxa" w:w="60"/>
+              <w:left w:type="dxa" w:w="100"/>
+              <w:bottom w:type="dxa" w:w="60"/>
+              <w:right w:type="dxa" w:w="100"/>
+            </w:tcMar>
+          </w:tcPr>
+          <w:p>
+            <w:pPr>
+              <w:spacing w:after="20" w:line="264"/>
+            </w:pPr>
+            <w:r>
+              <w:rPr>
+                <w:sz w:val="19"/>
+                <w:szCs w:val="19"/>
+              </w:rPr>
+              <w:t xml:space="preserve">k-means</w:t>
+            </w:r>
+          </w:p>
+        </w:tc>
+        <w:tc>
+          <w:tcPr>
+            <w:tcW w:type="dxa" w:w="6507"/>
+            <w:tcBorders>
+              <w:top w:val="single" w:color="D5D8E3" w:sz="4"/>
+              <w:left w:val="single" w:color="D5D8E3" w:sz="4"/>
+              <w:bottom w:val="single" w:color="D5D8E3" w:sz="4"/>
+              <w:right w:val="single" w:color="D5D8E3" w:sz="4"/>
+            </w:tcBorders>
+            <w:shd w:fill="FFFFFF" w:color="auto" w:val="clear"/>
+            <w:tcMar>
+              <w:top w:type="dxa" w:w="60"/>
+              <w:left w:type="dxa" w:w="100"/>
+              <w:bottom w:type="dxa" w:w="60"/>
+              <w:right w:type="dxa" w:w="100"/>
+            </w:tcMar>
+          </w:tcPr>
+          <w:p>
+            <w:pPr>
+              <w:spacing w:after="20" w:line="264"/>
+            </w:pPr>
+            <w:r>
+              <w:rPr>
+                <w:sz w:val="19"/>
+                <w:szCs w:val="19"/>
+              </w:rPr>
+              <w:t xml:space="preserve">Grouping pixels into a few main colours</w:t>
+            </w:r>
+          </w:p>
+        </w:tc>
+      </w:tr>
+      <w:tr>
+        <w:trPr>
+          <w:cantSplit/>
+          <w:tblHeader w:val="false"/>
+        </w:trPr>
+        <w:tc>
+          <w:tcPr>
+            <w:tcW w:type="dxa" w:w="2519"/>
+            <w:tcBorders>
+              <w:top w:val="single" w:color="D5D8E3" w:sz="4"/>
+              <w:left w:val="single" w:color="D5D8E3" w:sz="4"/>
+              <w:bottom w:val="single" w:color="D5D8E3" w:sz="4"/>
+              <w:right w:val="single" w:color="D5D8E3" w:sz="4"/>
+            </w:tcBorders>
+            <w:shd w:fill="FAFBFD" w:color="auto" w:val="clear"/>
+            <w:tcMar>
+              <w:top w:type="dxa" w:w="60"/>
+              <w:left w:type="dxa" w:w="100"/>
+              <w:bottom w:type="dxa" w:w="60"/>
+              <w:right w:type="dxa" w:w="100"/>
+            </w:tcMar>
+          </w:tcPr>
+          <w:p>
+            <w:pPr>
+              <w:spacing w:after="20" w:line="264"/>
+            </w:pPr>
+            <w:r>
+              <w:rPr>
+                <w:sz w:val="19"/>
+                <w:szCs w:val="19"/>
+              </w:rPr>
+              <w:t xml:space="preserve">Dedupe key</w:t>
+            </w:r>
+          </w:p>
+        </w:tc>
+        <w:tc>
+          <w:tcPr>
+            <w:tcW w:type="dxa" w:w="6507"/>
+            <w:tcBorders>
+              <w:top w:val="single" w:color="D5D8E3" w:sz="4"/>
+              <w:left w:val="single" w:color="D5D8E3" w:sz="4"/>
+              <w:bottom w:val="single" w:color="D5D8E3" w:sz="4"/>
+              <w:right w:val="single" w:color="D5D8E3" w:sz="4"/>
+            </w:tcBorders>
+            <w:shd w:fill="FAFBFD" w:color="auto" w:val="clear"/>
+            <w:tcMar>
+              <w:top w:type="dxa" w:w="60"/>
+              <w:left w:type="dxa" w:w="100"/>
+              <w:bottom w:type="dxa" w:w="60"/>
+              <w:right w:type="dxa" w:w="100"/>
+            </w:tcMar>
+          </w:tcPr>
+          <w:p>
+            <w:pPr>
+              <w:spacing w:after="20" w:line="264"/>
+            </w:pPr>
+            <w:r>
+              <w:rPr>
+                <w:sz w:val="19"/>
+                <w:szCs w:val="19"/>
+              </w:rPr>
+              <w:t xml:space="preserve">A unique label so the same thing can't be created twice</w:t>
             </w:r>
           </w:p>
         </w:tc>
@@ -8609,6 +12623,18 @@
   </w:num>
   <w:num w:numId="7">
     <w:abstractNumId w:val="7"/>
+    <w:lvlOverride w:ilvl="0">
+      <w:startOverride w:val="1"/>
+    </w:lvlOverride>
+  </w:num>
+  <w:num w:numId="8">
+    <w:abstractNumId w:val="8"/>
+    <w:lvlOverride w:ilvl="0">
+      <w:startOverride w:val="1"/>
+    </w:lvlOverride>
+  </w:num>
+  <w:num w:numId="9">
+    <w:abstractNumId w:val="9"/>
     <w:lvlOverride w:ilvl="0">
       <w:startOverride w:val="1"/>
     </w:lvlOverride>

</xml_diff>